<commit_message>
feat(evaluation): standardize Kalman evaluation pipeline
</commit_message>
<xml_diff>
--- a/docs/draft/roadmap.docx
+++ b/docs/draft/roadmap.docx
@@ -32470,18 +32470,6 @@
       <w:pPr>
         <w:spacing w:after="0" w:line="240" w:lineRule="auto"/>
         <w:rPr>
-          <w:b/>
-          <w:bCs/>
-          <w:noProof/>
-          <w:sz w:val="32"/>
-          <w:szCs w:val="32"/>
-        </w:rPr>
-      </w:pPr>
-    </w:p>
-    <w:p>
-      <w:pPr>
-        <w:spacing w:after="0" w:line="240" w:lineRule="auto"/>
-        <w:rPr>
           <w:noProof/>
           <w:sz w:val="24"/>
           <w:szCs w:val="24"/>
@@ -32494,6 +32482,4353 @@
           <w:szCs w:val="24"/>
         </w:rPr>
         <w:t>Train-only Temporal Preprocessing</w:t>
+      </w:r>
+    </w:p>
+    <w:p>
+      <w:pPr>
+        <w:spacing w:after="0" w:line="240" w:lineRule="auto"/>
+        <w:rPr>
+          <w:noProof/>
+          <w:sz w:val="24"/>
+          <w:szCs w:val="24"/>
+        </w:rPr>
+      </w:pPr>
+      <w:r>
+        <w:rPr>
+          <w:noProof/>
+          <w:sz w:val="24"/>
+          <w:szCs w:val="24"/>
+        </w:rPr>
+        <w:t>processed dataset</w:t>
+      </w:r>
+    </w:p>
+    <w:p>
+      <w:pPr>
+        <w:spacing w:after="0" w:line="240" w:lineRule="auto"/>
+        <w:rPr>
+          <w:noProof/>
+          <w:sz w:val="24"/>
+          <w:szCs w:val="24"/>
+        </w:rPr>
+      </w:pPr>
+      <w:r>
+        <w:rPr>
+          <w:noProof/>
+          <w:sz w:val="24"/>
+          <w:szCs w:val="24"/>
+        </w:rPr>
+        <w:t xml:space="preserve">      ↓</w:t>
+      </w:r>
+    </w:p>
+    <w:p>
+      <w:pPr>
+        <w:spacing w:after="0" w:line="240" w:lineRule="auto"/>
+        <w:rPr>
+          <w:noProof/>
+          <w:sz w:val="24"/>
+          <w:szCs w:val="24"/>
+        </w:rPr>
+      </w:pPr>
+      <w:r>
+        <w:rPr>
+          <w:noProof/>
+          <w:sz w:val="24"/>
+          <w:szCs w:val="24"/>
+        </w:rPr>
+        <w:t>holdout split</w:t>
+      </w:r>
+    </w:p>
+    <w:p>
+      <w:pPr>
+        <w:spacing w:after="0" w:line="240" w:lineRule="auto"/>
+        <w:rPr>
+          <w:noProof/>
+          <w:sz w:val="24"/>
+          <w:szCs w:val="24"/>
+        </w:rPr>
+      </w:pPr>
+      <w:r>
+        <w:rPr>
+          <w:noProof/>
+          <w:sz w:val="24"/>
+          <w:szCs w:val="24"/>
+        </w:rPr>
+        <w:t xml:space="preserve">      ↓</w:t>
+      </w:r>
+    </w:p>
+    <w:p>
+      <w:pPr>
+        <w:spacing w:after="0" w:line="240" w:lineRule="auto"/>
+        <w:rPr>
+          <w:noProof/>
+          <w:sz w:val="24"/>
+          <w:szCs w:val="24"/>
+        </w:rPr>
+      </w:pPr>
+      <w:r>
+        <w:rPr>
+          <w:noProof/>
+          <w:sz w:val="24"/>
+          <w:szCs w:val="24"/>
+        </w:rPr>
+        <w:t>training partition only</w:t>
+      </w:r>
+    </w:p>
+    <w:p>
+      <w:pPr>
+        <w:spacing w:after="0" w:line="240" w:lineRule="auto"/>
+        <w:rPr>
+          <w:noProof/>
+          <w:sz w:val="24"/>
+          <w:szCs w:val="24"/>
+        </w:rPr>
+      </w:pPr>
+      <w:r>
+        <w:rPr>
+          <w:noProof/>
+          <w:sz w:val="24"/>
+          <w:szCs w:val="24"/>
+        </w:rPr>
+        <w:t xml:space="preserve">      ↓</w:t>
+      </w:r>
+    </w:p>
+    <w:p>
+      <w:pPr>
+        <w:spacing w:after="0" w:line="240" w:lineRule="auto"/>
+        <w:rPr>
+          <w:noProof/>
+          <w:sz w:val="24"/>
+          <w:szCs w:val="24"/>
+        </w:rPr>
+      </w:pPr>
+      <w:r>
+        <w:rPr>
+          <w:noProof/>
+          <w:sz w:val="24"/>
+          <w:szCs w:val="24"/>
+        </w:rPr>
+        <w:t>TemporalPreprocessor</w:t>
+      </w:r>
+    </w:p>
+    <w:p>
+      <w:pPr>
+        <w:spacing w:after="0" w:line="240" w:lineRule="auto"/>
+        <w:rPr>
+          <w:noProof/>
+          <w:sz w:val="24"/>
+          <w:szCs w:val="24"/>
+        </w:rPr>
+      </w:pPr>
+      <w:r>
+        <w:rPr>
+          <w:noProof/>
+          <w:sz w:val="24"/>
+          <w:szCs w:val="24"/>
+        </w:rPr>
+        <w:t xml:space="preserve">      ↓</w:t>
+      </w:r>
+    </w:p>
+    <w:p>
+      <w:pPr>
+        <w:spacing w:after="0" w:line="240" w:lineRule="auto"/>
+        <w:rPr>
+          <w:noProof/>
+          <w:sz w:val="24"/>
+          <w:szCs w:val="24"/>
+        </w:rPr>
+      </w:pPr>
+      <w:r>
+        <w:rPr>
+          <w:noProof/>
+          <w:sz w:val="24"/>
+          <w:szCs w:val="24"/>
+        </w:rPr>
+        <w:t>interpolated training series</w:t>
+      </w:r>
+    </w:p>
+    <w:p>
+      <w:pPr>
+        <w:spacing w:after="0" w:line="240" w:lineRule="auto"/>
+        <w:rPr>
+          <w:noProof/>
+          <w:sz w:val="24"/>
+          <w:szCs w:val="24"/>
+        </w:rPr>
+      </w:pPr>
+      <w:r>
+        <w:rPr>
+          <w:noProof/>
+          <w:sz w:val="24"/>
+          <w:szCs w:val="24"/>
+        </w:rPr>
+        <w:t xml:space="preserve">      ↓</w:t>
+      </w:r>
+    </w:p>
+    <w:p>
+      <w:pPr>
+        <w:spacing w:after="0" w:line="240" w:lineRule="auto"/>
+        <w:rPr>
+          <w:noProof/>
+          <w:sz w:val="24"/>
+          <w:szCs w:val="24"/>
+        </w:rPr>
+      </w:pPr>
+      <w:r>
+        <w:rPr>
+          <w:noProof/>
+          <w:sz w:val="24"/>
+          <w:szCs w:val="24"/>
+        </w:rPr>
+        <w:t>model-specific preprocessing / fit</w:t>
+      </w:r>
+    </w:p>
+    <w:p>
+      <w:pPr>
+        <w:spacing w:after="0" w:line="240" w:lineRule="auto"/>
+        <w:rPr>
+          <w:noProof/>
+          <w:sz w:val="24"/>
+          <w:szCs w:val="24"/>
+        </w:rPr>
+      </w:pPr>
+    </w:p>
+    <w:p>
+      <w:pPr>
+        <w:spacing w:after="0" w:line="240" w:lineRule="auto"/>
+        <w:rPr>
+          <w:noProof/>
+          <w:sz w:val="24"/>
+          <w:szCs w:val="24"/>
+        </w:rPr>
+      </w:pPr>
+      <w:r>
+        <w:rPr>
+          <w:noProof/>
+          <w:sz w:val="24"/>
+          <w:szCs w:val="24"/>
+        </w:rPr>
+        <w:t>BatteryDataset</w:t>
+      </w:r>
+    </w:p>
+    <w:p>
+      <w:pPr>
+        <w:spacing w:after="0" w:line="240" w:lineRule="auto"/>
+        <w:rPr>
+          <w:noProof/>
+          <w:sz w:val="24"/>
+          <w:szCs w:val="24"/>
+        </w:rPr>
+      </w:pPr>
+      <w:r>
+        <w:rPr>
+          <w:noProof/>
+          <w:sz w:val="24"/>
+          <w:szCs w:val="24"/>
+        </w:rPr>
+        <w:t xml:space="preserve">      ↓</w:t>
+      </w:r>
+    </w:p>
+    <w:p>
+      <w:pPr>
+        <w:spacing w:after="0" w:line="240" w:lineRule="auto"/>
+        <w:rPr>
+          <w:noProof/>
+          <w:sz w:val="24"/>
+          <w:szCs w:val="24"/>
+        </w:rPr>
+      </w:pPr>
+      <w:r>
+        <w:rPr>
+          <w:noProof/>
+          <w:sz w:val="24"/>
+          <w:szCs w:val="24"/>
+        </w:rPr>
+        <w:t>TemporalPreprocessor.transform()</w:t>
+      </w:r>
+    </w:p>
+    <w:p>
+      <w:pPr>
+        <w:spacing w:after="0" w:line="240" w:lineRule="auto"/>
+        <w:rPr>
+          <w:noProof/>
+          <w:sz w:val="24"/>
+          <w:szCs w:val="24"/>
+        </w:rPr>
+      </w:pPr>
+      <w:r>
+        <w:rPr>
+          <w:noProof/>
+          <w:sz w:val="24"/>
+          <w:szCs w:val="24"/>
+        </w:rPr>
+        <w:t xml:space="preserve">      ↓</w:t>
+      </w:r>
+    </w:p>
+    <w:p>
+      <w:pPr>
+        <w:spacing w:after="0" w:line="240" w:lineRule="auto"/>
+        <w:rPr>
+          <w:noProof/>
+          <w:sz w:val="24"/>
+          <w:szCs w:val="24"/>
+        </w:rPr>
+      </w:pPr>
+      <w:r>
+        <w:rPr>
+          <w:noProof/>
+          <w:sz w:val="24"/>
+          <w:szCs w:val="24"/>
+        </w:rPr>
+        <w:t>new BatteryDataset</w:t>
+      </w:r>
+    </w:p>
+    <w:p>
+      <w:pPr>
+        <w:spacing w:after="0" w:line="240" w:lineRule="auto"/>
+        <w:rPr>
+          <w:b/>
+          <w:bCs/>
+          <w:noProof/>
+          <w:sz w:val="28"/>
+          <w:szCs w:val="28"/>
+        </w:rPr>
+      </w:pPr>
+      <w:r>
+        <w:rPr>
+          <w:b/>
+          <w:bCs/>
+          <w:noProof/>
+          <w:sz w:val="28"/>
+          <w:szCs w:val="28"/>
+        </w:rPr>
+        <w:t>Temporal Preprocessing</w:t>
+      </w:r>
+    </w:p>
+    <w:p>
+      <w:pPr>
+        <w:spacing w:after="0" w:line="240" w:lineRule="auto"/>
+        <w:rPr>
+          <w:noProof/>
+          <w:sz w:val="24"/>
+          <w:szCs w:val="24"/>
+        </w:rPr>
+      </w:pPr>
+    </w:p>
+    <w:p>
+      <w:pPr>
+        <w:spacing w:after="0" w:line="240" w:lineRule="auto"/>
+        <w:rPr>
+          <w:noProof/>
+          <w:sz w:val="24"/>
+          <w:szCs w:val="24"/>
+        </w:rPr>
+      </w:pPr>
+      <w:r>
+        <w:rPr>
+          <w:noProof/>
+          <w:sz w:val="24"/>
+          <w:szCs w:val="24"/>
+        </w:rPr>
+        <w:t>zenerestimation/</w:t>
+      </w:r>
+    </w:p>
+    <w:p>
+      <w:pPr>
+        <w:spacing w:after="0" w:line="240" w:lineRule="auto"/>
+        <w:rPr>
+          <w:noProof/>
+          <w:sz w:val="24"/>
+          <w:szCs w:val="24"/>
+        </w:rPr>
+      </w:pPr>
+      <w:r>
+        <w:rPr>
+          <w:noProof/>
+          <w:sz w:val="24"/>
+          <w:szCs w:val="24"/>
+        </w:rPr>
+        <w:t>│</w:t>
+      </w:r>
+    </w:p>
+    <w:p>
+      <w:pPr>
+        <w:spacing w:after="0" w:line="240" w:lineRule="auto"/>
+        <w:rPr>
+          <w:noProof/>
+          <w:sz w:val="24"/>
+          <w:szCs w:val="24"/>
+        </w:rPr>
+      </w:pPr>
+      <w:r>
+        <w:rPr>
+          <w:noProof/>
+          <w:sz w:val="24"/>
+          <w:szCs w:val="24"/>
+        </w:rPr>
+        <w:t>└── data/</w:t>
+      </w:r>
+    </w:p>
+    <w:p>
+      <w:pPr>
+        <w:spacing w:after="0" w:line="240" w:lineRule="auto"/>
+        <w:rPr>
+          <w:noProof/>
+          <w:sz w:val="24"/>
+          <w:szCs w:val="24"/>
+        </w:rPr>
+      </w:pPr>
+      <w:r>
+        <w:rPr>
+          <w:noProof/>
+          <w:sz w:val="24"/>
+          <w:szCs w:val="24"/>
+        </w:rPr>
+        <w:t xml:space="preserve">    │</w:t>
+      </w:r>
+    </w:p>
+    <w:p>
+      <w:pPr>
+        <w:spacing w:after="0" w:line="240" w:lineRule="auto"/>
+        <w:rPr>
+          <w:noProof/>
+          <w:sz w:val="24"/>
+          <w:szCs w:val="24"/>
+        </w:rPr>
+      </w:pPr>
+      <w:r>
+        <w:rPr>
+          <w:noProof/>
+          <w:sz w:val="24"/>
+          <w:szCs w:val="24"/>
+        </w:rPr>
+        <w:t xml:space="preserve">    </w:t>
+      </w:r>
+      <w:r>
+        <w:rPr>
+          <w:rFonts w:ascii="MS Gothic" w:eastAsia="MS Gothic" w:hAnsi="MS Gothic" w:cs="MS Gothic" w:hint="eastAsia"/>
+          <w:noProof/>
+          <w:sz w:val="24"/>
+          <w:szCs w:val="24"/>
+        </w:rPr>
+        <w:t>├</w:t>
+      </w:r>
+      <w:r>
+        <w:rPr>
+          <w:rFonts w:ascii="Calibri" w:hAnsi="Calibri" w:cs="Calibri"/>
+          <w:noProof/>
+          <w:sz w:val="24"/>
+          <w:szCs w:val="24"/>
+        </w:rPr>
+        <w:t>──</w:t>
+      </w:r>
+      <w:r>
+        <w:rPr>
+          <w:noProof/>
+          <w:sz w:val="24"/>
+          <w:szCs w:val="24"/>
+        </w:rPr>
+        <w:t xml:space="preserve"> __init__.py</w:t>
+      </w:r>
+    </w:p>
+    <w:p>
+      <w:pPr>
+        <w:spacing w:after="0" w:line="240" w:lineRule="auto"/>
+        <w:rPr>
+          <w:noProof/>
+          <w:sz w:val="24"/>
+          <w:szCs w:val="24"/>
+        </w:rPr>
+      </w:pPr>
+      <w:r>
+        <w:rPr>
+          <w:noProof/>
+          <w:sz w:val="24"/>
+          <w:szCs w:val="24"/>
+        </w:rPr>
+        <w:t xml:space="preserve">    │      └── exports BatteryDataset</w:t>
+      </w:r>
+    </w:p>
+    <w:p>
+      <w:pPr>
+        <w:spacing w:after="0" w:line="240" w:lineRule="auto"/>
+        <w:rPr>
+          <w:noProof/>
+          <w:sz w:val="24"/>
+          <w:szCs w:val="24"/>
+        </w:rPr>
+      </w:pPr>
+      <w:r>
+        <w:rPr>
+          <w:noProof/>
+          <w:sz w:val="24"/>
+          <w:szCs w:val="24"/>
+        </w:rPr>
+        <w:t xml:space="preserve">    │</w:t>
+      </w:r>
+    </w:p>
+    <w:p>
+      <w:pPr>
+        <w:spacing w:after="0" w:line="240" w:lineRule="auto"/>
+        <w:rPr>
+          <w:noProof/>
+          <w:sz w:val="24"/>
+          <w:szCs w:val="24"/>
+        </w:rPr>
+      </w:pPr>
+      <w:r>
+        <w:rPr>
+          <w:noProof/>
+          <w:sz w:val="24"/>
+          <w:szCs w:val="24"/>
+        </w:rPr>
+        <w:t xml:space="preserve">    </w:t>
+      </w:r>
+      <w:r>
+        <w:rPr>
+          <w:rFonts w:ascii="MS Gothic" w:eastAsia="MS Gothic" w:hAnsi="MS Gothic" w:cs="MS Gothic" w:hint="eastAsia"/>
+          <w:noProof/>
+          <w:sz w:val="24"/>
+          <w:szCs w:val="24"/>
+        </w:rPr>
+        <w:t>├</w:t>
+      </w:r>
+      <w:r>
+        <w:rPr>
+          <w:rFonts w:ascii="Calibri" w:hAnsi="Calibri" w:cs="Calibri"/>
+          <w:noProof/>
+          <w:sz w:val="24"/>
+          <w:szCs w:val="24"/>
+        </w:rPr>
+        <w:t>──</w:t>
+      </w:r>
+      <w:r>
+        <w:rPr>
+          <w:noProof/>
+          <w:sz w:val="24"/>
+          <w:szCs w:val="24"/>
+        </w:rPr>
+        <w:t xml:space="preserve"> dataset.py</w:t>
+      </w:r>
+    </w:p>
+    <w:p>
+      <w:pPr>
+        <w:spacing w:after="0" w:line="240" w:lineRule="auto"/>
+        <w:rPr>
+          <w:noProof/>
+          <w:sz w:val="24"/>
+          <w:szCs w:val="24"/>
+        </w:rPr>
+      </w:pPr>
+      <w:r>
+        <w:rPr>
+          <w:noProof/>
+          <w:sz w:val="24"/>
+          <w:szCs w:val="24"/>
+        </w:rPr>
+        <w:t xml:space="preserve">    │      └── BatteryDataset</w:t>
+      </w:r>
+    </w:p>
+    <w:p>
+      <w:pPr>
+        <w:spacing w:after="0" w:line="240" w:lineRule="auto"/>
+        <w:rPr>
+          <w:noProof/>
+          <w:sz w:val="24"/>
+          <w:szCs w:val="24"/>
+        </w:rPr>
+      </w:pPr>
+      <w:r>
+        <w:rPr>
+          <w:noProof/>
+          <w:sz w:val="24"/>
+          <w:szCs w:val="24"/>
+        </w:rPr>
+        <w:t xml:space="preserve">    │</w:t>
+      </w:r>
+    </w:p>
+    <w:p>
+      <w:pPr>
+        <w:spacing w:after="0" w:line="240" w:lineRule="auto"/>
+        <w:rPr>
+          <w:noProof/>
+          <w:sz w:val="24"/>
+          <w:szCs w:val="24"/>
+        </w:rPr>
+      </w:pPr>
+      <w:r>
+        <w:rPr>
+          <w:noProof/>
+          <w:sz w:val="24"/>
+          <w:szCs w:val="24"/>
+        </w:rPr>
+        <w:t xml:space="preserve">    └── preprocessing/</w:t>
+      </w:r>
+    </w:p>
+    <w:p>
+      <w:pPr>
+        <w:spacing w:after="0" w:line="240" w:lineRule="auto"/>
+        <w:rPr>
+          <w:noProof/>
+          <w:sz w:val="24"/>
+          <w:szCs w:val="24"/>
+        </w:rPr>
+      </w:pPr>
+      <w:r>
+        <w:rPr>
+          <w:noProof/>
+          <w:sz w:val="24"/>
+          <w:szCs w:val="24"/>
+        </w:rPr>
+        <w:t xml:space="preserve">           </w:t>
+      </w:r>
+      <w:r>
+        <w:rPr>
+          <w:rFonts w:ascii="MS Gothic" w:eastAsia="MS Gothic" w:hAnsi="MS Gothic" w:cs="MS Gothic" w:hint="eastAsia"/>
+          <w:noProof/>
+          <w:sz w:val="24"/>
+          <w:szCs w:val="24"/>
+        </w:rPr>
+        <w:t>├</w:t>
+      </w:r>
+      <w:r>
+        <w:rPr>
+          <w:rFonts w:ascii="Calibri" w:hAnsi="Calibri" w:cs="Calibri"/>
+          <w:noProof/>
+          <w:sz w:val="24"/>
+          <w:szCs w:val="24"/>
+        </w:rPr>
+        <w:t>──</w:t>
+      </w:r>
+      <w:r>
+        <w:rPr>
+          <w:noProof/>
+          <w:sz w:val="24"/>
+          <w:szCs w:val="24"/>
+        </w:rPr>
+        <w:t xml:space="preserve"> __init__.py</w:t>
+      </w:r>
+    </w:p>
+    <w:p>
+      <w:pPr>
+        <w:spacing w:after="0" w:line="240" w:lineRule="auto"/>
+        <w:rPr>
+          <w:noProof/>
+          <w:sz w:val="24"/>
+          <w:szCs w:val="24"/>
+        </w:rPr>
+      </w:pPr>
+      <w:r>
+        <w:rPr>
+          <w:noProof/>
+          <w:sz w:val="24"/>
+          <w:szCs w:val="24"/>
+        </w:rPr>
+        <w:t xml:space="preserve">           │      └── exports TemporalPreprocessor</w:t>
+      </w:r>
+    </w:p>
+    <w:p>
+      <w:pPr>
+        <w:spacing w:after="0" w:line="240" w:lineRule="auto"/>
+        <w:rPr>
+          <w:noProof/>
+          <w:sz w:val="24"/>
+          <w:szCs w:val="24"/>
+        </w:rPr>
+      </w:pPr>
+      <w:r>
+        <w:rPr>
+          <w:noProof/>
+          <w:sz w:val="24"/>
+          <w:szCs w:val="24"/>
+        </w:rPr>
+        <w:t xml:space="preserve">           │</w:t>
+      </w:r>
+    </w:p>
+    <w:p>
+      <w:pPr>
+        <w:spacing w:after="0" w:line="240" w:lineRule="auto"/>
+        <w:rPr>
+          <w:noProof/>
+          <w:sz w:val="24"/>
+          <w:szCs w:val="24"/>
+        </w:rPr>
+      </w:pPr>
+      <w:r>
+        <w:rPr>
+          <w:noProof/>
+          <w:sz w:val="24"/>
+          <w:szCs w:val="24"/>
+        </w:rPr>
+        <w:t xml:space="preserve">           └── temporal.py</w:t>
+      </w:r>
+    </w:p>
+    <w:p>
+      <w:pPr>
+        <w:spacing w:after="0" w:line="240" w:lineRule="auto"/>
+        <w:rPr>
+          <w:noProof/>
+          <w:sz w:val="24"/>
+          <w:szCs w:val="24"/>
+        </w:rPr>
+      </w:pPr>
+      <w:r>
+        <w:rPr>
+          <w:noProof/>
+          <w:sz w:val="24"/>
+          <w:szCs w:val="24"/>
+        </w:rPr>
+        <w:t xml:space="preserve">                  └── imports BatteryDataset</w:t>
+      </w:r>
+    </w:p>
+    <w:p>
+      <w:pPr>
+        <w:spacing w:after="0" w:line="240" w:lineRule="auto"/>
+        <w:rPr>
+          <w:noProof/>
+          <w:sz w:val="24"/>
+          <w:szCs w:val="24"/>
+        </w:rPr>
+      </w:pPr>
+    </w:p>
+    <w:p>
+      <w:pPr>
+        <w:spacing w:after="0" w:line="240" w:lineRule="auto"/>
+        <w:rPr>
+          <w:noProof/>
+          <w:sz w:val="24"/>
+          <w:szCs w:val="24"/>
+        </w:rPr>
+      </w:pPr>
+    </w:p>
+    <w:p>
+      <w:pPr>
+        <w:spacing w:after="0" w:line="240" w:lineRule="auto"/>
+        <w:rPr>
+          <w:b/>
+          <w:bCs/>
+          <w:noProof/>
+          <w:sz w:val="28"/>
+          <w:szCs w:val="28"/>
+        </w:rPr>
+      </w:pPr>
+      <w:r>
+        <w:rPr>
+          <w:b/>
+          <w:bCs/>
+          <w:noProof/>
+          <w:sz w:val="28"/>
+          <w:szCs w:val="28"/>
+        </w:rPr>
+        <w:t>Current 2A.5 status</w:t>
+      </w:r>
+    </w:p>
+    <w:p>
+      <w:pPr>
+        <w:spacing w:after="0" w:line="240" w:lineRule="auto"/>
+        <w:rPr>
+          <w:noProof/>
+          <w:sz w:val="24"/>
+          <w:szCs w:val="24"/>
+        </w:rPr>
+      </w:pPr>
+      <w:r>
+        <w:rPr>
+          <w:rFonts w:ascii="Segoe UI Symbol" w:hAnsi="Segoe UI Symbol" w:cs="Segoe UI Symbol"/>
+          <w:noProof/>
+          <w:sz w:val="24"/>
+          <w:szCs w:val="24"/>
+        </w:rPr>
+        <w:t>✓</w:t>
+      </w:r>
+      <w:r>
+        <w:rPr>
+          <w:noProof/>
+          <w:sz w:val="24"/>
+          <w:szCs w:val="24"/>
+        </w:rPr>
+        <w:t xml:space="preserve"> TemporalPreprocessor isolated from BatteryDataset</w:t>
+      </w:r>
+    </w:p>
+    <w:p>
+      <w:pPr>
+        <w:spacing w:after="0" w:line="240" w:lineRule="auto"/>
+        <w:rPr>
+          <w:noProof/>
+          <w:sz w:val="24"/>
+          <w:szCs w:val="24"/>
+        </w:rPr>
+      </w:pPr>
+      <w:r>
+        <w:rPr>
+          <w:rFonts w:ascii="Segoe UI Symbol" w:hAnsi="Segoe UI Symbol" w:cs="Segoe UI Symbol"/>
+          <w:noProof/>
+          <w:sz w:val="24"/>
+          <w:szCs w:val="24"/>
+        </w:rPr>
+        <w:t>✓</w:t>
+      </w:r>
+      <w:r>
+        <w:rPr>
+          <w:noProof/>
+          <w:sz w:val="24"/>
+          <w:szCs w:val="24"/>
+        </w:rPr>
+        <w:t xml:space="preserve"> linear interpolation of internal missing values</w:t>
+      </w:r>
+    </w:p>
+    <w:p>
+      <w:pPr>
+        <w:spacing w:after="0" w:line="240" w:lineRule="auto"/>
+        <w:rPr>
+          <w:noProof/>
+          <w:sz w:val="24"/>
+          <w:szCs w:val="24"/>
+        </w:rPr>
+      </w:pPr>
+      <w:r>
+        <w:rPr>
+          <w:rFonts w:ascii="Segoe UI Symbol" w:hAnsi="Segoe UI Symbol" w:cs="Segoe UI Symbol"/>
+          <w:noProof/>
+          <w:sz w:val="24"/>
+          <w:szCs w:val="24"/>
+        </w:rPr>
+        <w:t>✓</w:t>
+      </w:r>
+      <w:r>
+        <w:rPr>
+          <w:noProof/>
+          <w:sz w:val="24"/>
+          <w:szCs w:val="24"/>
+        </w:rPr>
+        <w:t xml:space="preserve"> explicit edge-gap policy</w:t>
+      </w:r>
+    </w:p>
+    <w:p>
+      <w:pPr>
+        <w:spacing w:after="0" w:line="240" w:lineRule="auto"/>
+        <w:rPr>
+          <w:noProof/>
+          <w:sz w:val="24"/>
+          <w:szCs w:val="24"/>
+        </w:rPr>
+      </w:pPr>
+      <w:r>
+        <w:rPr>
+          <w:rFonts w:ascii="Segoe UI Symbol" w:hAnsi="Segoe UI Symbol" w:cs="Segoe UI Symbol"/>
+          <w:noProof/>
+          <w:sz w:val="24"/>
+          <w:szCs w:val="24"/>
+        </w:rPr>
+        <w:t>✓</w:t>
+      </w:r>
+      <w:r>
+        <w:rPr>
+          <w:noProof/>
+          <w:sz w:val="24"/>
+          <w:szCs w:val="24"/>
+        </w:rPr>
+        <w:t xml:space="preserve"> is_observed provenance preserved</w:t>
+      </w:r>
+    </w:p>
+    <w:p>
+      <w:pPr>
+        <w:spacing w:after="0" w:line="240" w:lineRule="auto"/>
+        <w:rPr>
+          <w:noProof/>
+          <w:sz w:val="24"/>
+          <w:szCs w:val="24"/>
+        </w:rPr>
+      </w:pPr>
+      <w:r>
+        <w:rPr>
+          <w:rFonts w:ascii="Segoe UI Symbol" w:hAnsi="Segoe UI Symbol" w:cs="Segoe UI Symbol"/>
+          <w:noProof/>
+          <w:sz w:val="24"/>
+          <w:szCs w:val="24"/>
+        </w:rPr>
+        <w:t>✓</w:t>
+      </w:r>
+      <w:r>
+        <w:rPr>
+          <w:noProof/>
+          <w:sz w:val="24"/>
+          <w:szCs w:val="24"/>
+        </w:rPr>
+        <w:t xml:space="preserve"> original dataset remains unchanged</w:t>
+      </w:r>
+    </w:p>
+    <w:p>
+      <w:pPr>
+        <w:spacing w:after="0" w:line="240" w:lineRule="auto"/>
+        <w:rPr>
+          <w:noProof/>
+          <w:sz w:val="24"/>
+          <w:szCs w:val="24"/>
+        </w:rPr>
+      </w:pPr>
+      <w:r>
+        <w:rPr>
+          <w:rFonts w:ascii="Segoe UI Symbol" w:hAnsi="Segoe UI Symbol" w:cs="Segoe UI Symbol"/>
+          <w:noProof/>
+          <w:sz w:val="24"/>
+          <w:szCs w:val="24"/>
+        </w:rPr>
+        <w:t>✓</w:t>
+      </w:r>
+      <w:r>
+        <w:rPr>
+          <w:noProof/>
+          <w:sz w:val="24"/>
+          <w:szCs w:val="24"/>
+        </w:rPr>
+        <w:t xml:space="preserve"> dataset identity/provenance preserved</w:t>
+      </w:r>
+    </w:p>
+    <w:p>
+      <w:pPr>
+        <w:spacing w:after="0" w:line="240" w:lineRule="auto"/>
+        <w:rPr>
+          <w:noProof/>
+          <w:sz w:val="24"/>
+          <w:szCs w:val="24"/>
+        </w:rPr>
+      </w:pPr>
+      <w:r>
+        <w:rPr>
+          <w:rFonts w:ascii="Segoe UI Symbol" w:hAnsi="Segoe UI Symbol" w:cs="Segoe UI Symbol"/>
+          <w:noProof/>
+          <w:sz w:val="24"/>
+          <w:szCs w:val="24"/>
+        </w:rPr>
+        <w:t>✓</w:t>
+      </w:r>
+      <w:r>
+        <w:rPr>
+          <w:noProof/>
+          <w:sz w:val="24"/>
+          <w:szCs w:val="24"/>
+        </w:rPr>
+        <w:t xml:space="preserve"> validation/error handling</w:t>
+      </w:r>
+    </w:p>
+    <w:p>
+      <w:pPr>
+        <w:spacing w:after="0" w:line="240" w:lineRule="auto"/>
+        <w:rPr>
+          <w:noProof/>
+          <w:sz w:val="24"/>
+          <w:szCs w:val="24"/>
+        </w:rPr>
+      </w:pPr>
+      <w:r>
+        <w:rPr>
+          <w:rFonts w:ascii="Segoe UI Symbol" w:hAnsi="Segoe UI Symbol" w:cs="Segoe UI Symbol"/>
+          <w:noProof/>
+          <w:sz w:val="24"/>
+          <w:szCs w:val="24"/>
+        </w:rPr>
+        <w:t>✓</w:t>
+      </w:r>
+      <w:r>
+        <w:rPr>
+          <w:noProof/>
+          <w:sz w:val="24"/>
+          <w:szCs w:val="24"/>
+        </w:rPr>
+        <w:t xml:space="preserve"> fit_transform() contract</w:t>
+      </w:r>
+    </w:p>
+    <w:p>
+      <w:pPr>
+        <w:spacing w:after="0" w:line="240" w:lineRule="auto"/>
+        <w:rPr>
+          <w:noProof/>
+          <w:sz w:val="24"/>
+          <w:szCs w:val="24"/>
+        </w:rPr>
+      </w:pPr>
+      <w:r>
+        <w:rPr>
+          <w:rFonts w:ascii="Segoe UI Symbol" w:hAnsi="Segoe UI Symbol" w:cs="Segoe UI Symbol"/>
+          <w:noProof/>
+          <w:sz w:val="24"/>
+          <w:szCs w:val="24"/>
+        </w:rPr>
+        <w:t>✓</w:t>
+      </w:r>
+      <w:r>
+        <w:rPr>
+          <w:noProof/>
+          <w:sz w:val="24"/>
+          <w:szCs w:val="24"/>
+        </w:rPr>
+        <w:t xml:space="preserve"> 14 focused tests</w:t>
+      </w:r>
+    </w:p>
+    <w:p>
+      <w:pPr>
+        <w:spacing w:after="0" w:line="240" w:lineRule="auto"/>
+        <w:rPr>
+          <w:noProof/>
+          <w:sz w:val="24"/>
+          <w:szCs w:val="24"/>
+        </w:rPr>
+      </w:pPr>
+      <w:r>
+        <w:rPr>
+          <w:rFonts w:ascii="Segoe UI Symbol" w:hAnsi="Segoe UI Symbol" w:cs="Segoe UI Symbol"/>
+          <w:noProof/>
+          <w:sz w:val="24"/>
+          <w:szCs w:val="24"/>
+        </w:rPr>
+        <w:t>✓</w:t>
+      </w:r>
+      <w:r>
+        <w:rPr>
+          <w:noProof/>
+          <w:sz w:val="24"/>
+          <w:szCs w:val="24"/>
+        </w:rPr>
+        <w:t xml:space="preserve"> 338 full-suite tests</w:t>
+      </w:r>
+    </w:p>
+    <w:p>
+      <w:pPr>
+        <w:spacing w:after="0" w:line="240" w:lineRule="auto"/>
+        <w:rPr>
+          <w:noProof/>
+          <w:sz w:val="24"/>
+          <w:szCs w:val="24"/>
+        </w:rPr>
+      </w:pPr>
+    </w:p>
+    <w:p>
+      <w:pPr>
+        <w:spacing w:after="0" w:line="240" w:lineRule="auto"/>
+        <w:rPr>
+          <w:noProof/>
+          <w:sz w:val="24"/>
+          <w:szCs w:val="24"/>
+        </w:rPr>
+      </w:pPr>
+    </w:p>
+    <w:p>
+      <w:pPr>
+        <w:spacing w:after="0" w:line="240" w:lineRule="auto"/>
+        <w:rPr>
+          <w:noProof/>
+          <w:sz w:val="24"/>
+          <w:szCs w:val="24"/>
+        </w:rPr>
+      </w:pPr>
+    </w:p>
+    <w:p>
+      <w:pPr>
+        <w:spacing w:after="0" w:line="240" w:lineRule="auto"/>
+        <w:rPr>
+          <w:noProof/>
+          <w:sz w:val="24"/>
+          <w:szCs w:val="24"/>
+        </w:rPr>
+      </w:pPr>
+    </w:p>
+    <w:p>
+      <w:pPr>
+        <w:spacing w:after="0" w:line="240" w:lineRule="auto"/>
+        <w:rPr>
+          <w:noProof/>
+          <w:sz w:val="24"/>
+          <w:szCs w:val="24"/>
+        </w:rPr>
+      </w:pPr>
+    </w:p>
+    <w:p>
+      <w:pPr>
+        <w:spacing w:after="0" w:line="240" w:lineRule="auto"/>
+        <w:rPr>
+          <w:noProof/>
+          <w:sz w:val="24"/>
+          <w:szCs w:val="24"/>
+        </w:rPr>
+      </w:pPr>
+    </w:p>
+    <w:p>
+      <w:pPr>
+        <w:spacing w:after="0" w:line="240" w:lineRule="auto"/>
+        <w:rPr>
+          <w:noProof/>
+          <w:sz w:val="24"/>
+          <w:szCs w:val="24"/>
+        </w:rPr>
+      </w:pPr>
+    </w:p>
+    <w:p>
+      <w:pPr>
+        <w:spacing w:after="0" w:line="240" w:lineRule="auto"/>
+        <w:rPr>
+          <w:noProof/>
+          <w:sz w:val="24"/>
+          <w:szCs w:val="24"/>
+        </w:rPr>
+      </w:pPr>
+    </w:p>
+    <w:p>
+      <w:pPr>
+        <w:spacing w:after="0" w:line="240" w:lineRule="auto"/>
+        <w:rPr>
+          <w:noProof/>
+          <w:sz w:val="24"/>
+          <w:szCs w:val="24"/>
+        </w:rPr>
+      </w:pPr>
+    </w:p>
+    <w:p>
+      <w:pPr>
+        <w:spacing w:after="0" w:line="240" w:lineRule="auto"/>
+        <w:rPr>
+          <w:noProof/>
+          <w:sz w:val="24"/>
+          <w:szCs w:val="24"/>
+        </w:rPr>
+      </w:pPr>
+    </w:p>
+    <w:p>
+      <w:pPr>
+        <w:spacing w:after="0" w:line="240" w:lineRule="auto"/>
+        <w:rPr>
+          <w:noProof/>
+          <w:sz w:val="24"/>
+          <w:szCs w:val="24"/>
+        </w:rPr>
+      </w:pPr>
+    </w:p>
+    <w:p>
+      <w:pPr>
+        <w:spacing w:after="0" w:line="240" w:lineRule="auto"/>
+        <w:rPr>
+          <w:noProof/>
+          <w:sz w:val="24"/>
+          <w:szCs w:val="24"/>
+        </w:rPr>
+      </w:pPr>
+    </w:p>
+    <w:p>
+      <w:pPr>
+        <w:spacing w:after="0" w:line="240" w:lineRule="auto"/>
+        <w:rPr>
+          <w:b/>
+          <w:bCs/>
+          <w:noProof/>
+          <w:sz w:val="28"/>
+          <w:szCs w:val="28"/>
+          <w:u w:val="single"/>
+        </w:rPr>
+      </w:pPr>
+      <w:r>
+        <w:rPr>
+          <w:b/>
+          <w:bCs/>
+          <w:noProof/>
+          <w:sz w:val="28"/>
+          <w:szCs w:val="28"/>
+          <w:u w:val="single"/>
+        </w:rPr>
+        <w:lastRenderedPageBreak/>
+        <w:t>ForecastEvaluator</w:t>
+      </w:r>
+      <w:r>
+        <w:rPr>
+          <w:b/>
+          <w:bCs/>
+          <w:noProof/>
+          <w:sz w:val="28"/>
+          <w:szCs w:val="28"/>
+          <w:u w:val="single"/>
+        </w:rPr>
+        <w:t>:</w:t>
+      </w:r>
+    </w:p>
+    <w:p>
+      <w:pPr>
+        <w:spacing w:after="0" w:line="240" w:lineRule="auto"/>
+        <w:rPr>
+          <w:noProof/>
+          <w:sz w:val="24"/>
+          <w:szCs w:val="24"/>
+        </w:rPr>
+      </w:pPr>
+    </w:p>
+    <w:p>
+      <w:pPr>
+        <w:spacing w:after="0" w:line="240" w:lineRule="auto"/>
+        <w:rPr>
+          <w:noProof/>
+          <w:sz w:val="24"/>
+          <w:szCs w:val="24"/>
+        </w:rPr>
+      </w:pPr>
+      <w:r>
+        <w:rPr>
+          <w:noProof/>
+          <w:sz w:val="24"/>
+          <w:szCs w:val="24"/>
+        </w:rPr>
+        <w:t>BatteryDataset</w:t>
+      </w:r>
+    </w:p>
+    <w:p>
+      <w:pPr>
+        <w:spacing w:after="0" w:line="240" w:lineRule="auto"/>
+        <w:rPr>
+          <w:noProof/>
+          <w:sz w:val="24"/>
+          <w:szCs w:val="24"/>
+        </w:rPr>
+      </w:pPr>
+      <w:r>
+        <w:rPr>
+          <w:noProof/>
+          <w:sz w:val="24"/>
+          <w:szCs w:val="24"/>
+        </w:rPr>
+        <w:t xml:space="preserve">      ↓</w:t>
+      </w:r>
+    </w:p>
+    <w:p>
+      <w:pPr>
+        <w:spacing w:after="0" w:line="240" w:lineRule="auto"/>
+        <w:rPr>
+          <w:noProof/>
+          <w:sz w:val="24"/>
+          <w:szCs w:val="24"/>
+        </w:rPr>
+      </w:pPr>
+      <w:r>
+        <w:rPr>
+          <w:noProof/>
+          <w:sz w:val="24"/>
+          <w:szCs w:val="24"/>
+        </w:rPr>
+        <w:t>split_dataset()</w:t>
+      </w:r>
+    </w:p>
+    <w:p>
+      <w:pPr>
+        <w:spacing w:after="0" w:line="240" w:lineRule="auto"/>
+        <w:rPr>
+          <w:noProof/>
+          <w:sz w:val="24"/>
+          <w:szCs w:val="24"/>
+        </w:rPr>
+      </w:pPr>
+      <w:r>
+        <w:rPr>
+          <w:noProof/>
+          <w:sz w:val="24"/>
+          <w:szCs w:val="24"/>
+        </w:rPr>
+        <w:t xml:space="preserve">      ↓</w:t>
+      </w:r>
+    </w:p>
+    <w:p>
+      <w:pPr>
+        <w:spacing w:after="0" w:line="240" w:lineRule="auto"/>
+        <w:rPr>
+          <w:noProof/>
+          <w:sz w:val="24"/>
+          <w:szCs w:val="24"/>
+        </w:rPr>
+      </w:pPr>
+      <w:r>
+        <w:rPr>
+          <w:noProof/>
+          <w:sz w:val="24"/>
+          <w:szCs w:val="24"/>
+        </w:rPr>
+        <w:t>training BatteryDataset</w:t>
+      </w:r>
+    </w:p>
+    <w:p>
+      <w:pPr>
+        <w:spacing w:after="0" w:line="240" w:lineRule="auto"/>
+        <w:rPr>
+          <w:noProof/>
+          <w:sz w:val="24"/>
+          <w:szCs w:val="24"/>
+        </w:rPr>
+      </w:pPr>
+      <w:r>
+        <w:rPr>
+          <w:noProof/>
+          <w:sz w:val="24"/>
+          <w:szCs w:val="24"/>
+        </w:rPr>
+        <w:t xml:space="preserve">      ↓</w:t>
+      </w:r>
+    </w:p>
+    <w:p>
+      <w:pPr>
+        <w:spacing w:after="0" w:line="240" w:lineRule="auto"/>
+        <w:rPr>
+          <w:noProof/>
+          <w:sz w:val="24"/>
+          <w:szCs w:val="24"/>
+        </w:rPr>
+      </w:pPr>
+      <w:r>
+        <w:rPr>
+          <w:noProof/>
+          <w:sz w:val="24"/>
+          <w:szCs w:val="24"/>
+        </w:rPr>
+        <w:t>model.fit(training)</w:t>
+      </w:r>
+    </w:p>
+    <w:p>
+      <w:pPr>
+        <w:spacing w:after="0" w:line="240" w:lineRule="auto"/>
+        <w:rPr>
+          <w:noProof/>
+          <w:sz w:val="24"/>
+          <w:szCs w:val="24"/>
+        </w:rPr>
+      </w:pPr>
+    </w:p>
+    <w:p>
+      <w:pPr>
+        <w:spacing w:after="0" w:line="240" w:lineRule="auto"/>
+        <w:rPr>
+          <w:noProof/>
+          <w:sz w:val="24"/>
+          <w:szCs w:val="24"/>
+        </w:rPr>
+      </w:pPr>
+    </w:p>
+    <w:p>
+      <w:pPr>
+        <w:spacing w:after="0" w:line="240" w:lineRule="auto"/>
+        <w:rPr>
+          <w:b/>
+          <w:bCs/>
+          <w:noProof/>
+          <w:sz w:val="28"/>
+          <w:szCs w:val="28"/>
+          <w:u w:val="single"/>
+        </w:rPr>
+      </w:pPr>
+      <w:r>
+        <w:rPr>
+          <w:b/>
+          <w:bCs/>
+          <w:noProof/>
+          <w:sz w:val="28"/>
+          <w:szCs w:val="28"/>
+          <w:u w:val="single"/>
+        </w:rPr>
+        <w:t>Planned</w:t>
+      </w:r>
+      <w:r>
+        <w:rPr>
+          <w:b/>
+          <w:bCs/>
+          <w:noProof/>
+          <w:sz w:val="28"/>
+          <w:szCs w:val="28"/>
+          <w:u w:val="single"/>
+        </w:rPr>
+        <w:t>:</w:t>
+      </w:r>
+    </w:p>
+    <w:p>
+      <w:pPr>
+        <w:spacing w:after="0" w:line="240" w:lineRule="auto"/>
+        <w:rPr>
+          <w:b/>
+          <w:bCs/>
+          <w:noProof/>
+          <w:sz w:val="28"/>
+          <w:szCs w:val="28"/>
+          <w:u w:val="single"/>
+        </w:rPr>
+      </w:pPr>
+      <w:r>
+        <w:rPr>
+          <w:b/>
+          <w:bCs/>
+          <w:noProof/>
+          <w:sz w:val="28"/>
+          <w:szCs w:val="28"/>
+          <w:u w:val="single"/>
+        </w:rPr>
+        <w:t>Milestone 2A.5 — Part 2</w:t>
+      </w:r>
+    </w:p>
+    <w:p>
+      <w:pPr>
+        <w:spacing w:after="0" w:line="240" w:lineRule="auto"/>
+        <w:rPr>
+          <w:b/>
+          <w:bCs/>
+          <w:noProof/>
+          <w:sz w:val="28"/>
+          <w:szCs w:val="28"/>
+          <w:u w:val="single"/>
+        </w:rPr>
+      </w:pPr>
+      <w:r>
+        <w:rPr>
+          <w:b/>
+          <w:bCs/>
+          <w:noProof/>
+          <w:sz w:val="28"/>
+          <w:szCs w:val="28"/>
+          <w:u w:val="single"/>
+        </w:rPr>
+        <w:t>Leakage-Safe Evaluation Integration</w:t>
+      </w:r>
+    </w:p>
+    <w:p>
+      <w:pPr>
+        <w:spacing w:after="0" w:line="240" w:lineRule="auto"/>
+        <w:rPr>
+          <w:noProof/>
+          <w:sz w:val="24"/>
+          <w:szCs w:val="24"/>
+        </w:rPr>
+      </w:pPr>
+    </w:p>
+    <w:p>
+      <w:pPr>
+        <w:spacing w:after="0" w:line="240" w:lineRule="auto"/>
+        <w:rPr>
+          <w:noProof/>
+          <w:sz w:val="24"/>
+          <w:szCs w:val="24"/>
+        </w:rPr>
+      </w:pPr>
+      <w:r>
+        <w:rPr>
+          <w:noProof/>
+          <w:sz w:val="24"/>
+          <w:szCs w:val="24"/>
+        </w:rPr>
+        <w:t>Canonical BatteryDataset</w:t>
+      </w:r>
+    </w:p>
+    <w:p>
+      <w:pPr>
+        <w:spacing w:after="0" w:line="240" w:lineRule="auto"/>
+        <w:rPr>
+          <w:noProof/>
+          <w:sz w:val="24"/>
+          <w:szCs w:val="24"/>
+        </w:rPr>
+      </w:pPr>
+      <w:r>
+        <w:rPr>
+          <w:noProof/>
+          <w:sz w:val="24"/>
+          <w:szCs w:val="24"/>
+        </w:rPr>
+        <w:t xml:space="preserve">          ↓</w:t>
+      </w:r>
+    </w:p>
+    <w:p>
+      <w:pPr>
+        <w:spacing w:after="0" w:line="240" w:lineRule="auto"/>
+        <w:rPr>
+          <w:noProof/>
+          <w:sz w:val="24"/>
+          <w:szCs w:val="24"/>
+        </w:rPr>
+      </w:pPr>
+      <w:r>
+        <w:rPr>
+          <w:noProof/>
+          <w:sz w:val="24"/>
+          <w:szCs w:val="24"/>
+        </w:rPr>
+        <w:t xml:space="preserve">     split_dataset()</w:t>
+      </w:r>
+    </w:p>
+    <w:p>
+      <w:pPr>
+        <w:spacing w:after="0" w:line="240" w:lineRule="auto"/>
+        <w:rPr>
+          <w:noProof/>
+          <w:sz w:val="24"/>
+          <w:szCs w:val="24"/>
+        </w:rPr>
+      </w:pPr>
+      <w:r>
+        <w:rPr>
+          <w:noProof/>
+          <w:sz w:val="24"/>
+          <w:szCs w:val="24"/>
+        </w:rPr>
+        <w:t xml:space="preserve">       ↙       ↘</w:t>
+      </w:r>
+    </w:p>
+    <w:p>
+      <w:pPr>
+        <w:spacing w:after="0" w:line="240" w:lineRule="auto"/>
+        <w:rPr>
+          <w:noProof/>
+          <w:sz w:val="24"/>
+          <w:szCs w:val="24"/>
+        </w:rPr>
+      </w:pPr>
+      <w:r>
+        <w:rPr>
+          <w:noProof/>
+          <w:sz w:val="24"/>
+          <w:szCs w:val="24"/>
+        </w:rPr>
+        <w:t xml:space="preserve">    TRAIN     HOLDOUT</w:t>
+      </w:r>
+    </w:p>
+    <w:p>
+      <w:pPr>
+        <w:spacing w:after="0" w:line="240" w:lineRule="auto"/>
+        <w:rPr>
+          <w:noProof/>
+          <w:sz w:val="24"/>
+          <w:szCs w:val="24"/>
+        </w:rPr>
+      </w:pPr>
+      <w:r>
+        <w:rPr>
+          <w:noProof/>
+          <w:sz w:val="24"/>
+          <w:szCs w:val="24"/>
+        </w:rPr>
+        <w:t xml:space="preserve">      │         </w:t>
+      </w:r>
+      <w:r>
+        <w:rPr>
+          <w:noProof/>
+          <w:sz w:val="24"/>
+          <w:szCs w:val="24"/>
+        </w:rPr>
+        <w:t xml:space="preserve">       </w:t>
+      </w:r>
+      <w:r>
+        <w:rPr>
+          <w:noProof/>
+          <w:sz w:val="24"/>
+          <w:szCs w:val="24"/>
+        </w:rPr>
+        <w:t xml:space="preserve"> </w:t>
+      </w:r>
+      <w:r>
+        <w:rPr>
+          <w:noProof/>
+          <w:sz w:val="24"/>
+          <w:szCs w:val="24"/>
+        </w:rPr>
+        <w:t xml:space="preserve">      </w:t>
+      </w:r>
+      <w:r>
+        <w:rPr>
+          <w:noProof/>
+          <w:sz w:val="24"/>
+          <w:szCs w:val="24"/>
+        </w:rPr>
+        <w:t>│</w:t>
+      </w:r>
+    </w:p>
+    <w:p>
+      <w:pPr>
+        <w:spacing w:after="0" w:line="240" w:lineRule="auto"/>
+        <w:rPr>
+          <w:noProof/>
+          <w:sz w:val="24"/>
+          <w:szCs w:val="24"/>
+        </w:rPr>
+      </w:pPr>
+      <w:r>
+        <w:rPr>
+          <w:noProof/>
+          <w:sz w:val="24"/>
+          <w:szCs w:val="24"/>
+        </w:rPr>
+        <w:t xml:space="preserve">      </w:t>
+      </w:r>
+      <w:r>
+        <w:rPr>
+          <w:rFonts w:ascii="Arial" w:hAnsi="Arial" w:cs="Arial"/>
+          <w:noProof/>
+          <w:sz w:val="24"/>
+          <w:szCs w:val="24"/>
+        </w:rPr>
+        <w:t>▼</w:t>
+      </w:r>
+      <w:r>
+        <w:rPr>
+          <w:noProof/>
+          <w:sz w:val="24"/>
+          <w:szCs w:val="24"/>
+        </w:rPr>
+        <w:t xml:space="preserve">        </w:t>
+      </w:r>
+      <w:r>
+        <w:rPr>
+          <w:noProof/>
+          <w:sz w:val="24"/>
+          <w:szCs w:val="24"/>
+        </w:rPr>
+        <w:t xml:space="preserve">     </w:t>
+      </w:r>
+      <w:r>
+        <w:rPr>
+          <w:noProof/>
+          <w:sz w:val="24"/>
+          <w:szCs w:val="24"/>
+        </w:rPr>
+        <w:t xml:space="preserve">  </w:t>
+      </w:r>
+      <w:r>
+        <w:rPr>
+          <w:noProof/>
+          <w:sz w:val="24"/>
+          <w:szCs w:val="24"/>
+        </w:rPr>
+        <w:t xml:space="preserve">      </w:t>
+      </w:r>
+      <w:r>
+        <w:rPr>
+          <w:rFonts w:ascii="Calibri" w:hAnsi="Calibri" w:cs="Calibri"/>
+          <w:noProof/>
+          <w:sz w:val="24"/>
+          <w:szCs w:val="24"/>
+        </w:rPr>
+        <w:t>│</w:t>
+      </w:r>
+    </w:p>
+    <w:p>
+      <w:pPr>
+        <w:spacing w:after="0" w:line="240" w:lineRule="auto"/>
+        <w:rPr>
+          <w:noProof/>
+          <w:sz w:val="24"/>
+          <w:szCs w:val="24"/>
+        </w:rPr>
+      </w:pPr>
+      <w:r>
+        <w:rPr>
+          <w:noProof/>
+          <w:sz w:val="24"/>
+          <w:szCs w:val="24"/>
+        </w:rPr>
+        <w:t>TemporalPreprocessor</w:t>
+      </w:r>
+    </w:p>
+    <w:p>
+      <w:pPr>
+        <w:spacing w:after="0" w:line="240" w:lineRule="auto"/>
+        <w:rPr>
+          <w:noProof/>
+          <w:sz w:val="24"/>
+          <w:szCs w:val="24"/>
+        </w:rPr>
+      </w:pPr>
+      <w:r>
+        <w:rPr>
+          <w:noProof/>
+          <w:sz w:val="24"/>
+          <w:szCs w:val="24"/>
+        </w:rPr>
+        <w:t xml:space="preserve">      │         </w:t>
+      </w:r>
+      <w:r>
+        <w:rPr>
+          <w:noProof/>
+          <w:sz w:val="24"/>
+          <w:szCs w:val="24"/>
+        </w:rPr>
+        <w:t xml:space="preserve">             </w:t>
+      </w:r>
+      <w:r>
+        <w:rPr>
+          <w:noProof/>
+          <w:sz w:val="24"/>
+          <w:szCs w:val="24"/>
+        </w:rPr>
+        <w:t xml:space="preserve"> │</w:t>
+      </w:r>
+    </w:p>
+    <w:p>
+      <w:pPr>
+        <w:spacing w:after="0" w:line="240" w:lineRule="auto"/>
+        <w:rPr>
+          <w:noProof/>
+          <w:sz w:val="24"/>
+          <w:szCs w:val="24"/>
+        </w:rPr>
+      </w:pPr>
+      <w:r>
+        <w:rPr>
+          <w:noProof/>
+          <w:sz w:val="24"/>
+          <w:szCs w:val="24"/>
+        </w:rPr>
+        <w:t xml:space="preserve">      </w:t>
+      </w:r>
+      <w:r>
+        <w:rPr>
+          <w:rFonts w:ascii="Arial" w:hAnsi="Arial" w:cs="Arial"/>
+          <w:noProof/>
+          <w:sz w:val="24"/>
+          <w:szCs w:val="24"/>
+        </w:rPr>
+        <w:t>▼</w:t>
+      </w:r>
+      <w:r>
+        <w:rPr>
+          <w:noProof/>
+          <w:sz w:val="24"/>
+          <w:szCs w:val="24"/>
+        </w:rPr>
+        <w:t xml:space="preserve">          </w:t>
+      </w:r>
+      <w:r>
+        <w:rPr>
+          <w:noProof/>
+          <w:sz w:val="24"/>
+          <w:szCs w:val="24"/>
+        </w:rPr>
+        <w:t xml:space="preserve">           </w:t>
+      </w:r>
+      <w:r>
+        <w:rPr>
+          <w:rFonts w:ascii="Calibri" w:hAnsi="Calibri" w:cs="Calibri"/>
+          <w:noProof/>
+          <w:sz w:val="24"/>
+          <w:szCs w:val="24"/>
+        </w:rPr>
+        <w:t>│</w:t>
+      </w:r>
+    </w:p>
+    <w:p>
+      <w:pPr>
+        <w:spacing w:after="0" w:line="240" w:lineRule="auto"/>
+        <w:rPr>
+          <w:noProof/>
+          <w:sz w:val="24"/>
+          <w:szCs w:val="24"/>
+        </w:rPr>
+      </w:pPr>
+      <w:r>
+        <w:rPr>
+          <w:noProof/>
+          <w:sz w:val="24"/>
+          <w:szCs w:val="24"/>
+        </w:rPr>
+        <w:t>prepared TRAIN   │</w:t>
+      </w:r>
+    </w:p>
+    <w:p>
+      <w:pPr>
+        <w:spacing w:after="0" w:line="240" w:lineRule="auto"/>
+        <w:rPr>
+          <w:noProof/>
+          <w:sz w:val="24"/>
+          <w:szCs w:val="24"/>
+        </w:rPr>
+      </w:pPr>
+      <w:r>
+        <w:rPr>
+          <w:noProof/>
+          <w:sz w:val="24"/>
+          <w:szCs w:val="24"/>
+        </w:rPr>
+        <w:t xml:space="preserve">      │          </w:t>
+      </w:r>
+      <w:r>
+        <w:rPr>
+          <w:noProof/>
+          <w:sz w:val="24"/>
+          <w:szCs w:val="24"/>
+        </w:rPr>
+        <w:t xml:space="preserve">              </w:t>
+      </w:r>
+      <w:r>
+        <w:rPr>
+          <w:noProof/>
+          <w:sz w:val="24"/>
+          <w:szCs w:val="24"/>
+        </w:rPr>
+        <w:t>│</w:t>
+      </w:r>
+    </w:p>
+    <w:p>
+      <w:pPr>
+        <w:spacing w:after="0" w:line="240" w:lineRule="auto"/>
+        <w:rPr>
+          <w:noProof/>
+          <w:sz w:val="24"/>
+          <w:szCs w:val="24"/>
+        </w:rPr>
+      </w:pPr>
+      <w:r>
+        <w:rPr>
+          <w:noProof/>
+          <w:sz w:val="24"/>
+          <w:szCs w:val="24"/>
+        </w:rPr>
+        <w:t xml:space="preserve">      </w:t>
+      </w:r>
+      <w:r>
+        <w:rPr>
+          <w:rFonts w:ascii="Arial" w:hAnsi="Arial" w:cs="Arial"/>
+          <w:noProof/>
+          <w:sz w:val="24"/>
+          <w:szCs w:val="24"/>
+        </w:rPr>
+        <w:t>▼</w:t>
+      </w:r>
+      <w:r>
+        <w:rPr>
+          <w:noProof/>
+          <w:sz w:val="24"/>
+          <w:szCs w:val="24"/>
+        </w:rPr>
+        <w:t xml:space="preserve">          </w:t>
+      </w:r>
+      <w:r>
+        <w:rPr>
+          <w:noProof/>
+          <w:sz w:val="24"/>
+          <w:szCs w:val="24"/>
+        </w:rPr>
+        <w:t xml:space="preserve">            </w:t>
+      </w:r>
+      <w:r>
+        <w:rPr>
+          <w:rFonts w:ascii="Calibri" w:hAnsi="Calibri" w:cs="Calibri"/>
+          <w:noProof/>
+          <w:sz w:val="24"/>
+          <w:szCs w:val="24"/>
+        </w:rPr>
+        <w:t>│</w:t>
+      </w:r>
+    </w:p>
+    <w:p>
+      <w:pPr>
+        <w:spacing w:after="0" w:line="240" w:lineRule="auto"/>
+        <w:rPr>
+          <w:noProof/>
+          <w:sz w:val="24"/>
+          <w:szCs w:val="24"/>
+        </w:rPr>
+      </w:pPr>
+      <w:r>
+        <w:rPr>
+          <w:noProof/>
+          <w:sz w:val="24"/>
+          <w:szCs w:val="24"/>
+        </w:rPr>
+        <w:t xml:space="preserve">   model.fit()   </w:t>
+      </w:r>
+      <w:r>
+        <w:rPr>
+          <w:noProof/>
+          <w:sz w:val="24"/>
+          <w:szCs w:val="24"/>
+        </w:rPr>
+        <w:t xml:space="preserve">       </w:t>
+      </w:r>
+      <w:r>
+        <w:rPr>
+          <w:noProof/>
+          <w:sz w:val="24"/>
+          <w:szCs w:val="24"/>
+        </w:rPr>
+        <w:t>│</w:t>
+      </w:r>
+    </w:p>
+    <w:p>
+      <w:pPr>
+        <w:spacing w:after="0" w:line="240" w:lineRule="auto"/>
+        <w:rPr>
+          <w:noProof/>
+          <w:sz w:val="24"/>
+          <w:szCs w:val="24"/>
+        </w:rPr>
+      </w:pPr>
+      <w:r>
+        <w:rPr>
+          <w:noProof/>
+          <w:sz w:val="24"/>
+          <w:szCs w:val="24"/>
+        </w:rPr>
+        <w:t xml:space="preserve">      │          </w:t>
+      </w:r>
+      <w:r>
+        <w:rPr>
+          <w:noProof/>
+          <w:sz w:val="24"/>
+          <w:szCs w:val="24"/>
+        </w:rPr>
+        <w:t xml:space="preserve">              </w:t>
+      </w:r>
+      <w:r>
+        <w:rPr>
+          <w:noProof/>
+          <w:sz w:val="24"/>
+          <w:szCs w:val="24"/>
+        </w:rPr>
+        <w:t>│</w:t>
+      </w:r>
+    </w:p>
+    <w:p>
+      <w:pPr>
+        <w:spacing w:after="0" w:line="240" w:lineRule="auto"/>
+        <w:rPr>
+          <w:noProof/>
+          <w:sz w:val="24"/>
+          <w:szCs w:val="24"/>
+        </w:rPr>
+      </w:pPr>
+      <w:r>
+        <w:rPr>
+          <w:noProof/>
+          <w:sz w:val="24"/>
+          <w:szCs w:val="24"/>
+        </w:rPr>
+        <w:t xml:space="preserve">      └──────</w:t>
+      </w:r>
+      <w:r>
+        <w:rPr>
+          <w:rFonts w:ascii="MS Gothic" w:eastAsia="MS Gothic" w:hAnsi="MS Gothic" w:cs="MS Gothic" w:hint="eastAsia"/>
+          <w:noProof/>
+          <w:sz w:val="24"/>
+          <w:szCs w:val="24"/>
+        </w:rPr>
+        <w:t>┬</w:t>
+      </w:r>
+      <w:r>
+        <w:rPr>
+          <w:rFonts w:ascii="Calibri" w:hAnsi="Calibri" w:cs="Calibri"/>
+          <w:noProof/>
+          <w:sz w:val="24"/>
+          <w:szCs w:val="24"/>
+        </w:rPr>
+        <w:t>───┘</w:t>
+      </w:r>
+    </w:p>
+    <w:p>
+      <w:pPr>
+        <w:spacing w:after="0" w:line="240" w:lineRule="auto"/>
+        <w:rPr>
+          <w:noProof/>
+          <w:sz w:val="24"/>
+          <w:szCs w:val="24"/>
+        </w:rPr>
+      </w:pPr>
+      <w:r>
+        <w:rPr>
+          <w:noProof/>
+          <w:sz w:val="24"/>
+          <w:szCs w:val="24"/>
+        </w:rPr>
+        <w:t xml:space="preserve">             </w:t>
+      </w:r>
+      <w:r>
+        <w:rPr>
+          <w:noProof/>
+          <w:sz w:val="24"/>
+          <w:szCs w:val="24"/>
+        </w:rPr>
+        <w:t xml:space="preserve">        </w:t>
+      </w:r>
+      <w:r>
+        <w:rPr>
+          <w:rFonts w:ascii="Arial" w:hAnsi="Arial" w:cs="Arial"/>
+          <w:noProof/>
+          <w:sz w:val="24"/>
+          <w:szCs w:val="24"/>
+        </w:rPr>
+        <w:t>▼</w:t>
+      </w:r>
+    </w:p>
+    <w:p>
+      <w:pPr>
+        <w:spacing w:after="0" w:line="240" w:lineRule="auto"/>
+        <w:rPr>
+          <w:noProof/>
+          <w:sz w:val="24"/>
+          <w:szCs w:val="24"/>
+        </w:rPr>
+      </w:pPr>
+      <w:r>
+        <w:rPr>
+          <w:noProof/>
+          <w:sz w:val="24"/>
+          <w:szCs w:val="24"/>
+        </w:rPr>
+        <w:t xml:space="preserve">       model.predict()</w:t>
+      </w:r>
+    </w:p>
+    <w:p>
+      <w:pPr>
+        <w:spacing w:after="0" w:line="240" w:lineRule="auto"/>
+        <w:rPr>
+          <w:noProof/>
+          <w:sz w:val="24"/>
+          <w:szCs w:val="24"/>
+        </w:rPr>
+      </w:pPr>
+      <w:r>
+        <w:rPr>
+          <w:noProof/>
+          <w:sz w:val="24"/>
+          <w:szCs w:val="24"/>
+        </w:rPr>
+        <w:t xml:space="preserve">             </w:t>
+      </w:r>
+      <w:r>
+        <w:rPr>
+          <w:noProof/>
+          <w:sz w:val="24"/>
+          <w:szCs w:val="24"/>
+        </w:rPr>
+        <w:t xml:space="preserve">        </w:t>
+      </w:r>
+      <w:r>
+        <w:rPr>
+          <w:noProof/>
+          <w:sz w:val="24"/>
+          <w:szCs w:val="24"/>
+        </w:rPr>
+        <w:t>│</w:t>
+      </w:r>
+    </w:p>
+    <w:p>
+      <w:pPr>
+        <w:spacing w:after="0" w:line="240" w:lineRule="auto"/>
+        <w:rPr>
+          <w:noProof/>
+          <w:sz w:val="24"/>
+          <w:szCs w:val="24"/>
+        </w:rPr>
+      </w:pPr>
+      <w:r>
+        <w:rPr>
+          <w:noProof/>
+          <w:sz w:val="24"/>
+          <w:szCs w:val="24"/>
+        </w:rPr>
+        <w:t xml:space="preserve">             </w:t>
+      </w:r>
+      <w:r>
+        <w:rPr>
+          <w:noProof/>
+          <w:sz w:val="24"/>
+          <w:szCs w:val="24"/>
+        </w:rPr>
+        <w:t xml:space="preserve">       </w:t>
+      </w:r>
+      <w:r>
+        <w:rPr>
+          <w:rFonts w:ascii="Arial" w:hAnsi="Arial" w:cs="Arial"/>
+          <w:noProof/>
+          <w:sz w:val="24"/>
+          <w:szCs w:val="24"/>
+        </w:rPr>
+        <w:t>▼</w:t>
+      </w:r>
+    </w:p>
+    <w:p>
+      <w:pPr>
+        <w:spacing w:after="0" w:line="240" w:lineRule="auto"/>
+        <w:rPr>
+          <w:noProof/>
+          <w:sz w:val="24"/>
+          <w:szCs w:val="24"/>
+        </w:rPr>
+      </w:pPr>
+      <w:r>
+        <w:rPr>
+          <w:noProof/>
+          <w:sz w:val="24"/>
+          <w:szCs w:val="24"/>
+        </w:rPr>
+        <w:t xml:space="preserve">       EvaluationResult</w:t>
+      </w:r>
+    </w:p>
+    <w:p>
+      <w:pPr>
+        <w:spacing w:after="0" w:line="240" w:lineRule="auto"/>
+        <w:rPr>
+          <w:noProof/>
+          <w:sz w:val="24"/>
+          <w:szCs w:val="24"/>
+        </w:rPr>
+      </w:pPr>
+    </w:p>
+    <w:p>
+      <w:pPr>
+        <w:spacing w:after="0" w:line="240" w:lineRule="auto"/>
+        <w:rPr>
+          <w:b/>
+          <w:bCs/>
+          <w:noProof/>
+          <w:sz w:val="24"/>
+          <w:szCs w:val="24"/>
+          <w:u w:val="single"/>
+        </w:rPr>
+      </w:pPr>
+      <w:r>
+        <w:rPr>
+          <w:b/>
+          <w:bCs/>
+          <w:noProof/>
+          <w:sz w:val="24"/>
+          <w:szCs w:val="24"/>
+          <w:u w:val="single"/>
+        </w:rPr>
+        <w:t>The critical invariant is:</w:t>
+      </w:r>
+    </w:p>
+    <w:p>
+      <w:pPr>
+        <w:spacing w:after="0" w:line="240" w:lineRule="auto"/>
+        <w:rPr>
+          <w:noProof/>
+          <w:sz w:val="24"/>
+          <w:szCs w:val="24"/>
+        </w:rPr>
+      </w:pPr>
+      <w:r>
+        <w:rPr>
+          <w:noProof/>
+          <w:sz w:val="24"/>
+          <w:szCs w:val="24"/>
+        </w:rPr>
+        <w:t>The validation/holdout partition must never be passed to TemporalPreprocessor before model prediction.</w:t>
+      </w:r>
+    </w:p>
+    <w:p>
+      <w:pPr>
+        <w:spacing w:after="0" w:line="240" w:lineRule="auto"/>
+        <w:rPr>
+          <w:noProof/>
+          <w:sz w:val="24"/>
+          <w:szCs w:val="24"/>
+        </w:rPr>
+      </w:pPr>
+    </w:p>
+    <w:p>
+      <w:pPr>
+        <w:spacing w:after="0" w:line="240" w:lineRule="auto"/>
+        <w:rPr>
+          <w:noProof/>
+          <w:sz w:val="24"/>
+          <w:szCs w:val="24"/>
+        </w:rPr>
+      </w:pPr>
+    </w:p>
+    <w:p>
+      <w:pPr>
+        <w:spacing w:after="0" w:line="240" w:lineRule="auto"/>
+        <w:rPr>
+          <w:noProof/>
+          <w:sz w:val="24"/>
+          <w:szCs w:val="24"/>
+        </w:rPr>
+      </w:pPr>
+    </w:p>
+    <w:p>
+      <w:pPr>
+        <w:spacing w:after="0" w:line="240" w:lineRule="auto"/>
+        <w:rPr>
+          <w:noProof/>
+          <w:sz w:val="24"/>
+          <w:szCs w:val="24"/>
+        </w:rPr>
+      </w:pPr>
+    </w:p>
+    <w:p>
+      <w:pPr>
+        <w:spacing w:after="0" w:line="240" w:lineRule="auto"/>
+        <w:rPr>
+          <w:noProof/>
+          <w:sz w:val="24"/>
+          <w:szCs w:val="24"/>
+        </w:rPr>
+      </w:pPr>
+    </w:p>
+    <w:p>
+      <w:pPr>
+        <w:spacing w:after="0" w:line="240" w:lineRule="auto"/>
+        <w:rPr>
+          <w:b/>
+          <w:bCs/>
+          <w:noProof/>
+          <w:sz w:val="28"/>
+          <w:szCs w:val="28"/>
+          <w:u w:val="single"/>
+        </w:rPr>
+      </w:pPr>
+      <w:r>
+        <w:rPr>
+          <w:b/>
+          <w:bCs/>
+          <w:noProof/>
+          <w:sz w:val="28"/>
+          <w:szCs w:val="28"/>
+          <w:u w:val="single"/>
+        </w:rPr>
+        <w:t>E</w:t>
+      </w:r>
+      <w:r>
+        <w:rPr>
+          <w:b/>
+          <w:bCs/>
+          <w:noProof/>
+          <w:sz w:val="28"/>
+          <w:szCs w:val="28"/>
+          <w:u w:val="single"/>
+        </w:rPr>
+        <w:t>nforced framework contract</w:t>
+      </w:r>
+      <w:r>
+        <w:rPr>
+          <w:b/>
+          <w:bCs/>
+          <w:noProof/>
+          <w:sz w:val="28"/>
+          <w:szCs w:val="28"/>
+          <w:u w:val="single"/>
+        </w:rPr>
+        <w:t>:</w:t>
+      </w:r>
+    </w:p>
+    <w:p>
+      <w:pPr>
+        <w:spacing w:after="0" w:line="240" w:lineRule="auto"/>
+        <w:rPr>
+          <w:noProof/>
+          <w:sz w:val="24"/>
+          <w:szCs w:val="24"/>
+        </w:rPr>
+      </w:pPr>
+    </w:p>
+    <w:p>
+      <w:pPr>
+        <w:spacing w:after="0" w:line="240" w:lineRule="auto"/>
+        <w:rPr>
+          <w:noProof/>
+          <w:sz w:val="24"/>
+          <w:szCs w:val="24"/>
+        </w:rPr>
+      </w:pPr>
+      <w:r>
+        <w:rPr>
+          <w:noProof/>
+          <w:sz w:val="24"/>
+          <w:szCs w:val="24"/>
+        </w:rPr>
+        <w:t>1. preprocessing happens after the split</w:t>
+      </w:r>
+    </w:p>
+    <w:p>
+      <w:pPr>
+        <w:spacing w:after="0" w:line="240" w:lineRule="auto"/>
+        <w:rPr>
+          <w:noProof/>
+          <w:sz w:val="24"/>
+          <w:szCs w:val="24"/>
+        </w:rPr>
+      </w:pPr>
+      <w:r>
+        <w:rPr>
+          <w:noProof/>
+          <w:sz w:val="24"/>
+          <w:szCs w:val="24"/>
+        </w:rPr>
+        <w:t>2. only training rows reach the preprocessor</w:t>
+      </w:r>
+    </w:p>
+    <w:p>
+      <w:pPr>
+        <w:spacing w:after="0" w:line="240" w:lineRule="auto"/>
+        <w:rPr>
+          <w:noProof/>
+          <w:sz w:val="24"/>
+          <w:szCs w:val="24"/>
+        </w:rPr>
+      </w:pPr>
+      <w:r>
+        <w:rPr>
+          <w:noProof/>
+          <w:sz w:val="24"/>
+          <w:szCs w:val="24"/>
+        </w:rPr>
+        <w:t>3. holdout actual values remain unchanged</w:t>
+      </w:r>
+    </w:p>
+    <w:p>
+      <w:pPr>
+        <w:spacing w:after="0" w:line="240" w:lineRule="auto"/>
+        <w:rPr>
+          <w:noProof/>
+          <w:sz w:val="24"/>
+          <w:szCs w:val="24"/>
+        </w:rPr>
+      </w:pPr>
+      <w:r>
+        <w:rPr>
+          <w:noProof/>
+          <w:sz w:val="24"/>
+          <w:szCs w:val="24"/>
+        </w:rPr>
+        <w:t>4. a training missing period is filled</w:t>
+      </w:r>
+    </w:p>
+    <w:p>
+      <w:pPr>
+        <w:spacing w:after="0" w:line="240" w:lineRule="auto"/>
+        <w:rPr>
+          <w:noProof/>
+          <w:sz w:val="24"/>
+          <w:szCs w:val="24"/>
+        </w:rPr>
+      </w:pPr>
+      <w:r>
+        <w:rPr>
+          <w:noProof/>
+          <w:sz w:val="24"/>
+          <w:szCs w:val="24"/>
+        </w:rPr>
+        <w:t>5. the original canonical dataset remains unchanged</w:t>
+      </w:r>
+    </w:p>
+    <w:p>
+      <w:pPr>
+        <w:spacing w:after="0" w:line="240" w:lineRule="auto"/>
+        <w:rPr>
+          <w:noProof/>
+          <w:sz w:val="24"/>
+          <w:szCs w:val="24"/>
+        </w:rPr>
+      </w:pPr>
+      <w:r>
+        <w:rPr>
+          <w:noProof/>
+          <w:sz w:val="24"/>
+          <w:szCs w:val="24"/>
+        </w:rPr>
+        <w:t>6. evaluation still works without a preprocessor</w:t>
+      </w:r>
+    </w:p>
+    <w:p>
+      <w:pPr>
+        <w:spacing w:after="0" w:line="240" w:lineRule="auto"/>
+        <w:rPr>
+          <w:noProof/>
+          <w:sz w:val="24"/>
+          <w:szCs w:val="24"/>
+        </w:rPr>
+      </w:pPr>
+      <w:r>
+        <w:rPr>
+          <w:noProof/>
+          <w:sz w:val="24"/>
+          <w:szCs w:val="24"/>
+        </w:rPr>
+        <w:t>7. existing ARIMA evaluation remains backward-compatible</w:t>
+      </w:r>
+    </w:p>
+    <w:p>
+      <w:pPr>
+        <w:spacing w:after="0" w:line="240" w:lineRule="auto"/>
+        <w:rPr>
+          <w:b/>
+          <w:bCs/>
+          <w:noProof/>
+          <w:sz w:val="24"/>
+          <w:szCs w:val="24"/>
+        </w:rPr>
+      </w:pPr>
+    </w:p>
+    <w:p>
+      <w:pPr>
+        <w:spacing w:after="0" w:line="240" w:lineRule="auto"/>
+        <w:rPr>
+          <w:b/>
+          <w:bCs/>
+          <w:noProof/>
+          <w:sz w:val="28"/>
+          <w:szCs w:val="28"/>
+          <w:u w:val="single"/>
+        </w:rPr>
+      </w:pPr>
+      <w:r>
+        <w:rPr>
+          <w:b/>
+          <w:bCs/>
+          <w:noProof/>
+          <w:sz w:val="28"/>
+          <w:szCs w:val="28"/>
+          <w:u w:val="single"/>
+        </w:rPr>
+        <w:t>Leakage-Safe Evaluation Integration</w:t>
+      </w:r>
+      <w:r>
+        <w:rPr>
+          <w:b/>
+          <w:bCs/>
+          <w:noProof/>
+          <w:sz w:val="28"/>
+          <w:szCs w:val="28"/>
+          <w:u w:val="single"/>
+        </w:rPr>
+        <w:t>:</w:t>
+      </w:r>
+    </w:p>
+    <w:p>
+      <w:pPr>
+        <w:spacing w:after="0" w:line="240" w:lineRule="auto"/>
+        <w:rPr>
+          <w:noProof/>
+          <w:sz w:val="24"/>
+          <w:szCs w:val="24"/>
+        </w:rPr>
+      </w:pPr>
+    </w:p>
+    <w:p>
+      <w:pPr>
+        <w:spacing w:after="0" w:line="240" w:lineRule="auto"/>
+        <w:rPr>
+          <w:noProof/>
+          <w:sz w:val="24"/>
+          <w:szCs w:val="24"/>
+        </w:rPr>
+      </w:pPr>
+      <w:r>
+        <w:rPr>
+          <w:noProof/>
+          <w:sz w:val="24"/>
+          <w:szCs w:val="24"/>
+        </w:rPr>
+        <w:t>canonical dataset</w:t>
+      </w:r>
+    </w:p>
+    <w:p>
+      <w:pPr>
+        <w:spacing w:after="0" w:line="240" w:lineRule="auto"/>
+        <w:rPr>
+          <w:noProof/>
+          <w:sz w:val="24"/>
+          <w:szCs w:val="24"/>
+        </w:rPr>
+      </w:pPr>
+      <w:r>
+        <w:rPr>
+          <w:noProof/>
+          <w:sz w:val="24"/>
+          <w:szCs w:val="24"/>
+        </w:rPr>
+        <w:t xml:space="preserve">      ↓</w:t>
+      </w:r>
+    </w:p>
+    <w:p>
+      <w:pPr>
+        <w:spacing w:after="0" w:line="240" w:lineRule="auto"/>
+        <w:rPr>
+          <w:noProof/>
+          <w:sz w:val="24"/>
+          <w:szCs w:val="24"/>
+        </w:rPr>
+      </w:pPr>
+      <w:r>
+        <w:rPr>
+          <w:noProof/>
+          <w:sz w:val="24"/>
+          <w:szCs w:val="24"/>
+        </w:rPr>
+        <w:t>split train / holdout</w:t>
+      </w:r>
+    </w:p>
+    <w:p>
+      <w:pPr>
+        <w:spacing w:after="0" w:line="240" w:lineRule="auto"/>
+        <w:rPr>
+          <w:noProof/>
+          <w:sz w:val="24"/>
+          <w:szCs w:val="24"/>
+        </w:rPr>
+      </w:pPr>
+      <w:r>
+        <w:rPr>
+          <w:noProof/>
+          <w:sz w:val="24"/>
+          <w:szCs w:val="24"/>
+        </w:rPr>
+        <w:t xml:space="preserve">      ↓</w:t>
+      </w:r>
+    </w:p>
+    <w:p>
+      <w:pPr>
+        <w:spacing w:after="0" w:line="240" w:lineRule="auto"/>
+        <w:rPr>
+          <w:noProof/>
+          <w:sz w:val="24"/>
+          <w:szCs w:val="24"/>
+        </w:rPr>
+      </w:pPr>
+      <w:r>
+        <w:rPr>
+          <w:noProof/>
+          <w:sz w:val="24"/>
+          <w:szCs w:val="24"/>
+        </w:rPr>
+        <w:t>preprocess TRAIN only</w:t>
+      </w:r>
+    </w:p>
+    <w:p>
+      <w:pPr>
+        <w:spacing w:after="0" w:line="240" w:lineRule="auto"/>
+        <w:rPr>
+          <w:noProof/>
+          <w:sz w:val="24"/>
+          <w:szCs w:val="24"/>
+        </w:rPr>
+      </w:pPr>
+      <w:r>
+        <w:rPr>
+          <w:noProof/>
+          <w:sz w:val="24"/>
+          <w:szCs w:val="24"/>
+        </w:rPr>
+        <w:t xml:space="preserve">      ↓</w:t>
+      </w:r>
+    </w:p>
+    <w:p>
+      <w:pPr>
+        <w:spacing w:after="0" w:line="240" w:lineRule="auto"/>
+        <w:rPr>
+          <w:noProof/>
+          <w:sz w:val="24"/>
+          <w:szCs w:val="24"/>
+        </w:rPr>
+      </w:pPr>
+      <w:r>
+        <w:rPr>
+          <w:noProof/>
+          <w:sz w:val="24"/>
+          <w:szCs w:val="24"/>
+        </w:rPr>
+        <w:t>model.fit(prepared_train)</w:t>
+      </w:r>
+    </w:p>
+    <w:p>
+      <w:pPr>
+        <w:spacing w:after="0" w:line="240" w:lineRule="auto"/>
+        <w:rPr>
+          <w:noProof/>
+          <w:sz w:val="24"/>
+          <w:szCs w:val="24"/>
+        </w:rPr>
+      </w:pPr>
+      <w:r>
+        <w:rPr>
+          <w:noProof/>
+          <w:sz w:val="24"/>
+          <w:szCs w:val="24"/>
+        </w:rPr>
+        <w:t xml:space="preserve">      ↓</w:t>
+      </w:r>
+    </w:p>
+    <w:p>
+      <w:pPr>
+        <w:spacing w:after="0" w:line="240" w:lineRule="auto"/>
+        <w:rPr>
+          <w:noProof/>
+          <w:sz w:val="24"/>
+          <w:szCs w:val="24"/>
+        </w:rPr>
+      </w:pPr>
+      <w:r>
+        <w:rPr>
+          <w:noProof/>
+          <w:sz w:val="24"/>
+          <w:szCs w:val="24"/>
+        </w:rPr>
+        <w:t>model.predict(holdout_steps)</w:t>
+      </w:r>
+    </w:p>
+    <w:p>
+      <w:pPr>
+        <w:spacing w:after="0" w:line="240" w:lineRule="auto"/>
+        <w:rPr>
+          <w:noProof/>
+          <w:sz w:val="24"/>
+          <w:szCs w:val="24"/>
+        </w:rPr>
+      </w:pPr>
+      <w:r>
+        <w:rPr>
+          <w:noProof/>
+          <w:sz w:val="24"/>
+          <w:szCs w:val="24"/>
+        </w:rPr>
+        <w:t xml:space="preserve">      ↓</w:t>
+      </w:r>
+    </w:p>
+    <w:p>
+      <w:pPr>
+        <w:spacing w:after="0" w:line="240" w:lineRule="auto"/>
+        <w:rPr>
+          <w:noProof/>
+          <w:sz w:val="24"/>
+          <w:szCs w:val="24"/>
+        </w:rPr>
+      </w:pPr>
+      <w:r>
+        <w:rPr>
+          <w:noProof/>
+          <w:sz w:val="24"/>
+          <w:szCs w:val="24"/>
+        </w:rPr>
+        <w:t>compare against untouched holdout</w:t>
+      </w:r>
+    </w:p>
+    <w:p>
+      <w:pPr>
+        <w:spacing w:after="0" w:line="240" w:lineRule="auto"/>
+        <w:rPr>
+          <w:noProof/>
+          <w:sz w:val="24"/>
+          <w:szCs w:val="24"/>
+        </w:rPr>
+      </w:pPr>
+    </w:p>
+    <w:p>
+      <w:pPr>
+        <w:spacing w:after="0" w:line="240" w:lineRule="auto"/>
+        <w:rPr>
+          <w:noProof/>
+          <w:sz w:val="24"/>
+          <w:szCs w:val="24"/>
+        </w:rPr>
+      </w:pPr>
+      <w:r>
+        <w:rPr>
+          <w:rFonts w:ascii="Segoe UI Symbol" w:hAnsi="Segoe UI Symbol" w:cs="Segoe UI Symbol"/>
+          <w:noProof/>
+          <w:sz w:val="24"/>
+          <w:szCs w:val="24"/>
+        </w:rPr>
+        <w:t>✓</w:t>
+      </w:r>
+      <w:r>
+        <w:rPr>
+          <w:noProof/>
+          <w:sz w:val="24"/>
+          <w:szCs w:val="24"/>
+        </w:rPr>
+        <w:t xml:space="preserve"> evaluator accepts optional preprocessor</w:t>
+      </w:r>
+    </w:p>
+    <w:p>
+      <w:pPr>
+        <w:spacing w:after="0" w:line="240" w:lineRule="auto"/>
+        <w:rPr>
+          <w:noProof/>
+          <w:sz w:val="24"/>
+          <w:szCs w:val="24"/>
+        </w:rPr>
+      </w:pPr>
+      <w:r>
+        <w:rPr>
+          <w:rFonts w:ascii="Segoe UI Symbol" w:hAnsi="Segoe UI Symbol" w:cs="Segoe UI Symbol"/>
+          <w:noProof/>
+          <w:sz w:val="24"/>
+          <w:szCs w:val="24"/>
+        </w:rPr>
+        <w:t>✓</w:t>
+      </w:r>
+      <w:r>
+        <w:rPr>
+          <w:noProof/>
+          <w:sz w:val="24"/>
+          <w:szCs w:val="24"/>
+        </w:rPr>
+        <w:t xml:space="preserve"> default remains preprocessor=None</w:t>
+      </w:r>
+    </w:p>
+    <w:p>
+      <w:pPr>
+        <w:spacing w:after="0" w:line="240" w:lineRule="auto"/>
+        <w:rPr>
+          <w:noProof/>
+          <w:sz w:val="24"/>
+          <w:szCs w:val="24"/>
+        </w:rPr>
+      </w:pPr>
+      <w:r>
+        <w:rPr>
+          <w:rFonts w:ascii="Segoe UI Symbol" w:hAnsi="Segoe UI Symbol" w:cs="Segoe UI Symbol"/>
+          <w:noProof/>
+          <w:sz w:val="24"/>
+          <w:szCs w:val="24"/>
+        </w:rPr>
+        <w:t>✓</w:t>
+      </w:r>
+      <w:r>
+        <w:rPr>
+          <w:noProof/>
+          <w:sz w:val="24"/>
+          <w:szCs w:val="24"/>
+        </w:rPr>
+        <w:t xml:space="preserve"> split happens before preprocessing</w:t>
+      </w:r>
+    </w:p>
+    <w:p>
+      <w:pPr>
+        <w:spacing w:after="0" w:line="240" w:lineRule="auto"/>
+        <w:rPr>
+          <w:noProof/>
+          <w:sz w:val="24"/>
+          <w:szCs w:val="24"/>
+        </w:rPr>
+      </w:pPr>
+      <w:r>
+        <w:rPr>
+          <w:rFonts w:ascii="Segoe UI Symbol" w:hAnsi="Segoe UI Symbol" w:cs="Segoe UI Symbol"/>
+          <w:noProof/>
+          <w:sz w:val="24"/>
+          <w:szCs w:val="24"/>
+        </w:rPr>
+        <w:t>✓</w:t>
+      </w:r>
+      <w:r>
+        <w:rPr>
+          <w:noProof/>
+          <w:sz w:val="24"/>
+          <w:szCs w:val="24"/>
+        </w:rPr>
+        <w:t xml:space="preserve"> preprocessor sees training partition only</w:t>
+      </w:r>
+    </w:p>
+    <w:p>
+      <w:pPr>
+        <w:spacing w:after="0" w:line="240" w:lineRule="auto"/>
+        <w:rPr>
+          <w:noProof/>
+          <w:sz w:val="24"/>
+          <w:szCs w:val="24"/>
+        </w:rPr>
+      </w:pPr>
+      <w:r>
+        <w:rPr>
+          <w:rFonts w:ascii="Segoe UI Symbol" w:hAnsi="Segoe UI Symbol" w:cs="Segoe UI Symbol"/>
+          <w:noProof/>
+          <w:sz w:val="24"/>
+          <w:szCs w:val="24"/>
+        </w:rPr>
+        <w:t>✓</w:t>
+      </w:r>
+      <w:r>
+        <w:rPr>
+          <w:noProof/>
+          <w:sz w:val="24"/>
+          <w:szCs w:val="24"/>
+        </w:rPr>
+        <w:t xml:space="preserve"> holdout values cannot influence training interpolation</w:t>
+      </w:r>
+    </w:p>
+    <w:p>
+      <w:pPr>
+        <w:spacing w:after="0" w:line="240" w:lineRule="auto"/>
+        <w:rPr>
+          <w:noProof/>
+          <w:sz w:val="24"/>
+          <w:szCs w:val="24"/>
+        </w:rPr>
+      </w:pPr>
+      <w:r>
+        <w:rPr>
+          <w:rFonts w:ascii="Segoe UI Symbol" w:hAnsi="Segoe UI Symbol" w:cs="Segoe UI Symbol"/>
+          <w:noProof/>
+          <w:sz w:val="24"/>
+          <w:szCs w:val="24"/>
+        </w:rPr>
+        <w:t>✓</w:t>
+      </w:r>
+      <w:r>
+        <w:rPr>
+          <w:noProof/>
+          <w:sz w:val="24"/>
+          <w:szCs w:val="24"/>
+        </w:rPr>
+        <w:t xml:space="preserve"> model.fit() receives prepared training data</w:t>
+      </w:r>
+    </w:p>
+    <w:p>
+      <w:pPr>
+        <w:spacing w:after="0" w:line="240" w:lineRule="auto"/>
+        <w:rPr>
+          <w:noProof/>
+          <w:sz w:val="24"/>
+          <w:szCs w:val="24"/>
+        </w:rPr>
+      </w:pPr>
+      <w:r>
+        <w:rPr>
+          <w:rFonts w:ascii="Segoe UI Symbol" w:hAnsi="Segoe UI Symbol" w:cs="Segoe UI Symbol"/>
+          <w:noProof/>
+          <w:sz w:val="24"/>
+          <w:szCs w:val="24"/>
+        </w:rPr>
+        <w:t>✓</w:t>
+      </w:r>
+      <w:r>
+        <w:rPr>
+          <w:noProof/>
+          <w:sz w:val="24"/>
+          <w:szCs w:val="24"/>
+        </w:rPr>
+        <w:t xml:space="preserve"> holdout actual values remain untouched</w:t>
+      </w:r>
+    </w:p>
+    <w:p>
+      <w:pPr>
+        <w:spacing w:after="0" w:line="240" w:lineRule="auto"/>
+        <w:rPr>
+          <w:noProof/>
+          <w:sz w:val="24"/>
+          <w:szCs w:val="24"/>
+        </w:rPr>
+      </w:pPr>
+      <w:r>
+        <w:rPr>
+          <w:rFonts w:ascii="Segoe UI Symbol" w:hAnsi="Segoe UI Symbol" w:cs="Segoe UI Symbol"/>
+          <w:noProof/>
+          <w:sz w:val="24"/>
+          <w:szCs w:val="24"/>
+        </w:rPr>
+        <w:t>✓</w:t>
+      </w:r>
+      <w:r>
+        <w:rPr>
+          <w:noProof/>
+          <w:sz w:val="24"/>
+          <w:szCs w:val="24"/>
+        </w:rPr>
+        <w:t xml:space="preserve"> original canonical dataset remains untouched</w:t>
+      </w:r>
+    </w:p>
+    <w:p>
+      <w:pPr>
+        <w:spacing w:after="0" w:line="240" w:lineRule="auto"/>
+        <w:rPr>
+          <w:noProof/>
+          <w:sz w:val="24"/>
+          <w:szCs w:val="24"/>
+        </w:rPr>
+      </w:pPr>
+      <w:r>
+        <w:rPr>
+          <w:rFonts w:ascii="Segoe UI Symbol" w:hAnsi="Segoe UI Symbol" w:cs="Segoe UI Symbol"/>
+          <w:noProof/>
+          <w:sz w:val="24"/>
+          <w:szCs w:val="24"/>
+        </w:rPr>
+        <w:t>✓</w:t>
+      </w:r>
+      <w:r>
+        <w:rPr>
+          <w:noProof/>
+          <w:sz w:val="24"/>
+          <w:szCs w:val="24"/>
+        </w:rPr>
+        <w:t xml:space="preserve"> is_observed provenance survives interpolation</w:t>
+      </w:r>
+    </w:p>
+    <w:p>
+      <w:pPr>
+        <w:spacing w:after="0" w:line="240" w:lineRule="auto"/>
+        <w:rPr>
+          <w:noProof/>
+          <w:sz w:val="24"/>
+          <w:szCs w:val="24"/>
+        </w:rPr>
+      </w:pPr>
+      <w:r>
+        <w:rPr>
+          <w:rFonts w:ascii="Segoe UI Symbol" w:hAnsi="Segoe UI Symbol" w:cs="Segoe UI Symbol"/>
+          <w:noProof/>
+          <w:sz w:val="24"/>
+          <w:szCs w:val="24"/>
+        </w:rPr>
+        <w:t>✓</w:t>
+      </w:r>
+      <w:r>
+        <w:rPr>
+          <w:noProof/>
+          <w:sz w:val="24"/>
+          <w:szCs w:val="24"/>
+        </w:rPr>
+        <w:t xml:space="preserve"> legacy evaluator behavior remains supported</w:t>
+      </w:r>
+    </w:p>
+    <w:p>
+      <w:pPr>
+        <w:spacing w:after="0" w:line="240" w:lineRule="auto"/>
+        <w:rPr>
+          <w:noProof/>
+          <w:sz w:val="24"/>
+          <w:szCs w:val="24"/>
+        </w:rPr>
+      </w:pPr>
+      <w:r>
+        <w:rPr>
+          <w:rFonts w:ascii="Segoe UI Symbol" w:hAnsi="Segoe UI Symbol" w:cs="Segoe UI Symbol"/>
+          <w:noProof/>
+          <w:sz w:val="24"/>
+          <w:szCs w:val="24"/>
+        </w:rPr>
+        <w:t>✓</w:t>
+      </w:r>
+      <w:r>
+        <w:rPr>
+          <w:noProof/>
+          <w:sz w:val="24"/>
+          <w:szCs w:val="24"/>
+        </w:rPr>
+        <w:t xml:space="preserve"> complete existing suite remains green</w:t>
+      </w:r>
+    </w:p>
+    <w:p>
+      <w:pPr>
+        <w:spacing w:after="0" w:line="240" w:lineRule="auto"/>
+        <w:rPr>
+          <w:b/>
+          <w:bCs/>
+          <w:noProof/>
+          <w:sz w:val="28"/>
+          <w:szCs w:val="28"/>
+          <w:u w:val="single"/>
+        </w:rPr>
+      </w:pPr>
+      <w:r>
+        <w:rPr>
+          <w:b/>
+          <w:bCs/>
+          <w:noProof/>
+          <w:sz w:val="28"/>
+          <w:szCs w:val="28"/>
+          <w:u w:val="single"/>
+        </w:rPr>
+        <w:lastRenderedPageBreak/>
+        <w:t>ForecastEvaluator</w:t>
+      </w:r>
+      <w:r>
+        <w:rPr>
+          <w:b/>
+          <w:bCs/>
+          <w:noProof/>
+          <w:sz w:val="28"/>
+          <w:szCs w:val="28"/>
+          <w:u w:val="single"/>
+        </w:rPr>
+        <w:t>:</w:t>
+      </w:r>
+    </w:p>
+    <w:p>
+      <w:pPr>
+        <w:spacing w:after="0" w:line="240" w:lineRule="auto"/>
+        <w:rPr>
+          <w:noProof/>
+          <w:sz w:val="24"/>
+          <w:szCs w:val="24"/>
+        </w:rPr>
+      </w:pPr>
+    </w:p>
+    <w:p>
+      <w:pPr>
+        <w:spacing w:after="0" w:line="240" w:lineRule="auto"/>
+        <w:rPr>
+          <w:noProof/>
+          <w:sz w:val="24"/>
+          <w:szCs w:val="24"/>
+        </w:rPr>
+      </w:pPr>
+      <w:r>
+        <w:rPr>
+          <w:noProof/>
+          <w:sz w:val="24"/>
+          <w:szCs w:val="24"/>
+        </w:rPr>
+        <w:t>BatteryDataset</w:t>
+      </w:r>
+    </w:p>
+    <w:p>
+      <w:pPr>
+        <w:spacing w:after="0" w:line="240" w:lineRule="auto"/>
+        <w:rPr>
+          <w:noProof/>
+          <w:sz w:val="24"/>
+          <w:szCs w:val="24"/>
+        </w:rPr>
+      </w:pPr>
+      <w:r>
+        <w:rPr>
+          <w:noProof/>
+          <w:sz w:val="24"/>
+          <w:szCs w:val="24"/>
+        </w:rPr>
+        <w:t xml:space="preserve">      ↓</w:t>
+      </w:r>
+    </w:p>
+    <w:p>
+      <w:pPr>
+        <w:spacing w:after="0" w:line="240" w:lineRule="auto"/>
+        <w:rPr>
+          <w:noProof/>
+          <w:sz w:val="24"/>
+          <w:szCs w:val="24"/>
+        </w:rPr>
+      </w:pPr>
+      <w:r>
+        <w:rPr>
+          <w:noProof/>
+          <w:sz w:val="24"/>
+          <w:szCs w:val="24"/>
+        </w:rPr>
+        <w:t>validate dataset/model</w:t>
+      </w:r>
+    </w:p>
+    <w:p>
+      <w:pPr>
+        <w:spacing w:after="0" w:line="240" w:lineRule="auto"/>
+        <w:rPr>
+          <w:noProof/>
+          <w:sz w:val="24"/>
+          <w:szCs w:val="24"/>
+        </w:rPr>
+      </w:pPr>
+      <w:r>
+        <w:rPr>
+          <w:noProof/>
+          <w:sz w:val="24"/>
+          <w:szCs w:val="24"/>
+        </w:rPr>
+        <w:t xml:space="preserve">      ↓</w:t>
+      </w:r>
+    </w:p>
+    <w:p>
+      <w:pPr>
+        <w:spacing w:after="0" w:line="240" w:lineRule="auto"/>
+        <w:rPr>
+          <w:noProof/>
+          <w:sz w:val="24"/>
+          <w:szCs w:val="24"/>
+        </w:rPr>
+      </w:pPr>
+      <w:r>
+        <w:rPr>
+          <w:noProof/>
+          <w:sz w:val="24"/>
+          <w:szCs w:val="24"/>
+        </w:rPr>
+        <w:t>split holdout</w:t>
+      </w:r>
+    </w:p>
+    <w:p>
+      <w:pPr>
+        <w:spacing w:after="0" w:line="240" w:lineRule="auto"/>
+        <w:rPr>
+          <w:noProof/>
+          <w:sz w:val="24"/>
+          <w:szCs w:val="24"/>
+        </w:rPr>
+      </w:pPr>
+      <w:r>
+        <w:rPr>
+          <w:noProof/>
+          <w:sz w:val="24"/>
+          <w:szCs w:val="24"/>
+        </w:rPr>
+        <w:t xml:space="preserve">      ↓</w:t>
+      </w:r>
+    </w:p>
+    <w:p>
+      <w:pPr>
+        <w:spacing w:after="0" w:line="240" w:lineRule="auto"/>
+        <w:rPr>
+          <w:noProof/>
+          <w:sz w:val="24"/>
+          <w:szCs w:val="24"/>
+        </w:rPr>
+      </w:pPr>
+      <w:r>
+        <w:rPr>
+          <w:noProof/>
+          <w:sz w:val="24"/>
+          <w:szCs w:val="24"/>
+        </w:rPr>
+        <w:t>preprocess TRAIN only</w:t>
+      </w:r>
+    </w:p>
+    <w:p>
+      <w:pPr>
+        <w:spacing w:after="0" w:line="240" w:lineRule="auto"/>
+        <w:rPr>
+          <w:noProof/>
+          <w:sz w:val="24"/>
+          <w:szCs w:val="24"/>
+        </w:rPr>
+      </w:pPr>
+      <w:r>
+        <w:rPr>
+          <w:noProof/>
+          <w:sz w:val="24"/>
+          <w:szCs w:val="24"/>
+        </w:rPr>
+        <w:t xml:space="preserve">      ↓</w:t>
+      </w:r>
+    </w:p>
+    <w:p>
+      <w:pPr>
+        <w:spacing w:after="0" w:line="240" w:lineRule="auto"/>
+        <w:rPr>
+          <w:noProof/>
+          <w:sz w:val="24"/>
+          <w:szCs w:val="24"/>
+        </w:rPr>
+      </w:pPr>
+      <w:r>
+        <w:rPr>
+          <w:noProof/>
+          <w:sz w:val="24"/>
+          <w:szCs w:val="24"/>
+        </w:rPr>
+        <w:t>model.fit(train)</w:t>
+      </w:r>
+    </w:p>
+    <w:p>
+      <w:pPr>
+        <w:spacing w:after="0" w:line="240" w:lineRule="auto"/>
+        <w:rPr>
+          <w:noProof/>
+          <w:sz w:val="24"/>
+          <w:szCs w:val="24"/>
+        </w:rPr>
+      </w:pPr>
+      <w:r>
+        <w:rPr>
+          <w:noProof/>
+          <w:sz w:val="24"/>
+          <w:szCs w:val="24"/>
+        </w:rPr>
+        <w:t xml:space="preserve">      ↓</w:t>
+      </w:r>
+    </w:p>
+    <w:p>
+      <w:pPr>
+        <w:spacing w:after="0" w:line="240" w:lineRule="auto"/>
+        <w:rPr>
+          <w:noProof/>
+          <w:sz w:val="24"/>
+          <w:szCs w:val="24"/>
+        </w:rPr>
+      </w:pPr>
+      <w:r>
+        <w:rPr>
+          <w:noProof/>
+          <w:sz w:val="24"/>
+          <w:szCs w:val="24"/>
+        </w:rPr>
+        <w:t>model.predict(evaluation_steps)</w:t>
+      </w:r>
+    </w:p>
+    <w:p>
+      <w:pPr>
+        <w:spacing w:after="0" w:line="240" w:lineRule="auto"/>
+        <w:rPr>
+          <w:noProof/>
+          <w:sz w:val="24"/>
+          <w:szCs w:val="24"/>
+        </w:rPr>
+      </w:pPr>
+      <w:r>
+        <w:rPr>
+          <w:noProof/>
+          <w:sz w:val="24"/>
+          <w:szCs w:val="24"/>
+        </w:rPr>
+        <w:t xml:space="preserve">      ↓</w:t>
+      </w:r>
+    </w:p>
+    <w:p>
+      <w:pPr>
+        <w:spacing w:after="0" w:line="240" w:lineRule="auto"/>
+        <w:rPr>
+          <w:noProof/>
+          <w:sz w:val="24"/>
+          <w:szCs w:val="24"/>
+        </w:rPr>
+      </w:pPr>
+      <w:r>
+        <w:rPr>
+          <w:noProof/>
+          <w:sz w:val="24"/>
+          <w:szCs w:val="24"/>
+        </w:rPr>
+        <w:t>extract untouched holdout actuals</w:t>
+      </w:r>
+    </w:p>
+    <w:p>
+      <w:pPr>
+        <w:spacing w:after="0" w:line="240" w:lineRule="auto"/>
+        <w:rPr>
+          <w:noProof/>
+          <w:sz w:val="24"/>
+          <w:szCs w:val="24"/>
+        </w:rPr>
+      </w:pPr>
+      <w:r>
+        <w:rPr>
+          <w:noProof/>
+          <w:sz w:val="24"/>
+          <w:szCs w:val="24"/>
+        </w:rPr>
+        <w:t xml:space="preserve">      ↓</w:t>
+      </w:r>
+    </w:p>
+    <w:p>
+      <w:pPr>
+        <w:spacing w:after="0" w:line="240" w:lineRule="auto"/>
+        <w:rPr>
+          <w:noProof/>
+          <w:sz w:val="24"/>
+          <w:szCs w:val="24"/>
+        </w:rPr>
+      </w:pPr>
+      <w:r>
+        <w:rPr>
+          <w:noProof/>
+          <w:sz w:val="24"/>
+          <w:szCs w:val="24"/>
+        </w:rPr>
+        <w:t>calculate RMSE / MAE / MAPE</w:t>
+      </w:r>
+    </w:p>
+    <w:p>
+      <w:pPr>
+        <w:spacing w:after="0" w:line="240" w:lineRule="auto"/>
+        <w:rPr>
+          <w:noProof/>
+          <w:sz w:val="24"/>
+          <w:szCs w:val="24"/>
+        </w:rPr>
+      </w:pPr>
+      <w:r>
+        <w:rPr>
+          <w:noProof/>
+          <w:sz w:val="24"/>
+          <w:szCs w:val="24"/>
+        </w:rPr>
+        <w:t xml:space="preserve">      ↓</w:t>
+      </w:r>
+    </w:p>
+    <w:p>
+      <w:pPr>
+        <w:spacing w:after="0" w:line="240" w:lineRule="auto"/>
+        <w:rPr>
+          <w:noProof/>
+          <w:sz w:val="24"/>
+          <w:szCs w:val="24"/>
+        </w:rPr>
+      </w:pPr>
+      <w:r>
+        <w:rPr>
+          <w:noProof/>
+          <w:sz w:val="24"/>
+          <w:szCs w:val="24"/>
+        </w:rPr>
+        <w:t>EvaluationResult</w:t>
+      </w:r>
+    </w:p>
+    <w:p>
+      <w:pPr>
+        <w:spacing w:after="0" w:line="240" w:lineRule="auto"/>
+        <w:rPr>
+          <w:noProof/>
+          <w:sz w:val="24"/>
+          <w:szCs w:val="24"/>
+        </w:rPr>
+      </w:pPr>
+    </w:p>
+    <w:p>
+      <w:pPr>
+        <w:spacing w:after="0" w:line="240" w:lineRule="auto"/>
+        <w:rPr>
+          <w:noProof/>
+          <w:sz w:val="24"/>
+          <w:szCs w:val="24"/>
+        </w:rPr>
+      </w:pPr>
+    </w:p>
+    <w:p>
+      <w:pPr>
+        <w:spacing w:after="0" w:line="240" w:lineRule="auto"/>
+        <w:rPr>
+          <w:b/>
+          <w:bCs/>
+          <w:noProof/>
+          <w:sz w:val="28"/>
+          <w:szCs w:val="28"/>
+          <w:u w:val="single"/>
+        </w:rPr>
+      </w:pPr>
+      <w:r>
+        <w:rPr>
+          <w:b/>
+          <w:bCs/>
+          <w:noProof/>
+          <w:sz w:val="28"/>
+          <w:szCs w:val="28"/>
+          <w:u w:val="single"/>
+        </w:rPr>
+        <w:t>Sprint 12 Milestone 2B — Adaptive</w:t>
+      </w:r>
+      <w:r>
+        <w:rPr>
+          <w:b/>
+          <w:bCs/>
+          <w:noProof/>
+          <w:sz w:val="24"/>
+          <w:szCs w:val="24"/>
+        </w:rPr>
+        <w:t xml:space="preserve"> </w:t>
+      </w:r>
+      <w:r>
+        <w:rPr>
+          <w:b/>
+          <w:bCs/>
+          <w:noProof/>
+          <w:sz w:val="28"/>
+          <w:szCs w:val="28"/>
+          <w:u w:val="single"/>
+        </w:rPr>
+        <w:t>Kalman migration</w:t>
+      </w:r>
+    </w:p>
+    <w:p>
+      <w:pPr>
+        <w:spacing w:after="0" w:line="240" w:lineRule="auto"/>
+        <w:rPr>
+          <w:noProof/>
+          <w:sz w:val="24"/>
+          <w:szCs w:val="24"/>
+        </w:rPr>
+      </w:pPr>
+    </w:p>
+    <w:p>
+      <w:pPr>
+        <w:spacing w:after="0" w:line="240" w:lineRule="auto"/>
+        <w:rPr>
+          <w:noProof/>
+          <w:sz w:val="24"/>
+          <w:szCs w:val="24"/>
+        </w:rPr>
+      </w:pPr>
+      <w:r>
+        <w:rPr>
+          <w:noProof/>
+          <w:sz w:val="24"/>
+          <w:szCs w:val="24"/>
+        </w:rPr>
+        <w:t>BatteryDataset</w:t>
+      </w:r>
+    </w:p>
+    <w:p>
+      <w:pPr>
+        <w:spacing w:after="0" w:line="240" w:lineRule="auto"/>
+        <w:rPr>
+          <w:noProof/>
+          <w:sz w:val="24"/>
+          <w:szCs w:val="24"/>
+        </w:rPr>
+      </w:pPr>
+      <w:r>
+        <w:rPr>
+          <w:noProof/>
+          <w:sz w:val="24"/>
+          <w:szCs w:val="24"/>
+        </w:rPr>
+        <w:t xml:space="preserve">      ↓</w:t>
+      </w:r>
+    </w:p>
+    <w:p>
+      <w:pPr>
+        <w:spacing w:after="0" w:line="240" w:lineRule="auto"/>
+        <w:rPr>
+          <w:noProof/>
+          <w:sz w:val="24"/>
+          <w:szCs w:val="24"/>
+        </w:rPr>
+      </w:pPr>
+      <w:r>
+        <w:rPr>
+          <w:noProof/>
+          <w:sz w:val="24"/>
+          <w:szCs w:val="24"/>
+        </w:rPr>
+        <w:t>ForecastEvaluator</w:t>
+      </w:r>
+    </w:p>
+    <w:p>
+      <w:pPr>
+        <w:spacing w:after="0" w:line="240" w:lineRule="auto"/>
+        <w:rPr>
+          <w:noProof/>
+          <w:sz w:val="24"/>
+          <w:szCs w:val="24"/>
+        </w:rPr>
+      </w:pPr>
+      <w:r>
+        <w:rPr>
+          <w:noProof/>
+          <w:sz w:val="24"/>
+          <w:szCs w:val="24"/>
+        </w:rPr>
+        <w:t xml:space="preserve">      ↓</w:t>
+      </w:r>
+    </w:p>
+    <w:p>
+      <w:pPr>
+        <w:spacing w:after="0" w:line="240" w:lineRule="auto"/>
+        <w:rPr>
+          <w:noProof/>
+          <w:sz w:val="24"/>
+          <w:szCs w:val="24"/>
+        </w:rPr>
+      </w:pPr>
+      <w:r>
+        <w:rPr>
+          <w:noProof/>
+          <w:sz w:val="24"/>
+          <w:szCs w:val="24"/>
+        </w:rPr>
+        <w:t>TemporalPreprocessor(train only)</w:t>
+      </w:r>
+    </w:p>
+    <w:p>
+      <w:pPr>
+        <w:spacing w:after="0" w:line="240" w:lineRule="auto"/>
+        <w:rPr>
+          <w:noProof/>
+          <w:sz w:val="24"/>
+          <w:szCs w:val="24"/>
+        </w:rPr>
+      </w:pPr>
+      <w:r>
+        <w:rPr>
+          <w:noProof/>
+          <w:sz w:val="24"/>
+          <w:szCs w:val="24"/>
+        </w:rPr>
+        <w:t xml:space="preserve">      ↓</w:t>
+      </w:r>
+    </w:p>
+    <w:p>
+      <w:pPr>
+        <w:spacing w:after="0" w:line="240" w:lineRule="auto"/>
+        <w:rPr>
+          <w:noProof/>
+          <w:sz w:val="24"/>
+          <w:szCs w:val="24"/>
+        </w:rPr>
+      </w:pPr>
+      <w:r>
+        <w:rPr>
+          <w:noProof/>
+          <w:sz w:val="24"/>
+          <w:szCs w:val="24"/>
+        </w:rPr>
+        <w:t>AdaptiveKalmanFilter.fit()</w:t>
+      </w:r>
+    </w:p>
+    <w:p>
+      <w:pPr>
+        <w:spacing w:after="0" w:line="240" w:lineRule="auto"/>
+        <w:rPr>
+          <w:noProof/>
+          <w:sz w:val="24"/>
+          <w:szCs w:val="24"/>
+        </w:rPr>
+      </w:pPr>
+      <w:r>
+        <w:rPr>
+          <w:noProof/>
+          <w:sz w:val="24"/>
+          <w:szCs w:val="24"/>
+        </w:rPr>
+        <w:t xml:space="preserve">      ↓</w:t>
+      </w:r>
+    </w:p>
+    <w:p>
+      <w:pPr>
+        <w:spacing w:after="0" w:line="240" w:lineRule="auto"/>
+        <w:rPr>
+          <w:noProof/>
+          <w:sz w:val="24"/>
+          <w:szCs w:val="24"/>
+        </w:rPr>
+      </w:pPr>
+      <w:r>
+        <w:rPr>
+          <w:noProof/>
+          <w:sz w:val="24"/>
+          <w:szCs w:val="24"/>
+        </w:rPr>
+        <w:t>AdaptiveKalmanFilter.predict()</w:t>
+      </w:r>
+    </w:p>
+    <w:p>
+      <w:pPr>
+        <w:spacing w:after="0" w:line="240" w:lineRule="auto"/>
+        <w:rPr>
+          <w:noProof/>
+          <w:sz w:val="24"/>
+          <w:szCs w:val="24"/>
+        </w:rPr>
+      </w:pPr>
+      <w:r>
+        <w:rPr>
+          <w:noProof/>
+          <w:sz w:val="24"/>
+          <w:szCs w:val="24"/>
+        </w:rPr>
+        <w:t xml:space="preserve">      ↓</w:t>
+      </w:r>
+    </w:p>
+    <w:p>
+      <w:pPr>
+        <w:spacing w:after="0" w:line="240" w:lineRule="auto"/>
+        <w:rPr>
+          <w:noProof/>
+          <w:sz w:val="24"/>
+          <w:szCs w:val="24"/>
+        </w:rPr>
+      </w:pPr>
+      <w:r>
+        <w:rPr>
+          <w:noProof/>
+          <w:sz w:val="24"/>
+          <w:szCs w:val="24"/>
+        </w:rPr>
+        <w:t>EvaluationResult</w:t>
+      </w:r>
+    </w:p>
+    <w:p>
+      <w:pPr>
+        <w:spacing w:after="0" w:line="240" w:lineRule="auto"/>
+        <w:rPr>
+          <w:noProof/>
+          <w:sz w:val="24"/>
+          <w:szCs w:val="24"/>
+        </w:rPr>
+      </w:pPr>
+      <w:r>
+        <w:rPr>
+          <w:noProof/>
+          <w:sz w:val="24"/>
+          <w:szCs w:val="24"/>
+        </w:rPr>
+        <w:t xml:space="preserve">      ↓</w:t>
+      </w:r>
+    </w:p>
+    <w:p>
+      <w:pPr>
+        <w:spacing w:after="0" w:line="240" w:lineRule="auto"/>
+        <w:rPr>
+          <w:noProof/>
+          <w:sz w:val="24"/>
+          <w:szCs w:val="24"/>
+        </w:rPr>
+      </w:pPr>
+      <w:r>
+        <w:rPr>
+          <w:noProof/>
+          <w:sz w:val="24"/>
+          <w:szCs w:val="24"/>
+        </w:rPr>
+        <w:t>evaluation.json / comparison layer</w:t>
+      </w:r>
+    </w:p>
+    <w:p>
+      <w:pPr>
+        <w:spacing w:after="0" w:line="240" w:lineRule="auto"/>
+        <w:rPr>
+          <w:noProof/>
+          <w:sz w:val="24"/>
+          <w:szCs w:val="24"/>
+        </w:rPr>
+      </w:pPr>
+    </w:p>
+    <w:p>
+      <w:pPr>
+        <w:spacing w:after="0" w:line="240" w:lineRule="auto"/>
+        <w:rPr>
+          <w:noProof/>
+          <w:sz w:val="24"/>
+          <w:szCs w:val="24"/>
+        </w:rPr>
+      </w:pPr>
+    </w:p>
+    <w:p>
+      <w:pPr>
+        <w:spacing w:after="0" w:line="240" w:lineRule="auto"/>
+        <w:rPr>
+          <w:noProof/>
+          <w:sz w:val="24"/>
+          <w:szCs w:val="24"/>
+        </w:rPr>
+      </w:pPr>
+    </w:p>
+    <w:p>
+      <w:pPr>
+        <w:spacing w:after="0" w:line="240" w:lineRule="auto"/>
+        <w:rPr>
+          <w:noProof/>
+          <w:sz w:val="24"/>
+          <w:szCs w:val="24"/>
+        </w:rPr>
+      </w:pPr>
+    </w:p>
+    <w:p>
+      <w:pPr>
+        <w:spacing w:after="0" w:line="240" w:lineRule="auto"/>
+        <w:rPr>
+          <w:noProof/>
+          <w:sz w:val="24"/>
+          <w:szCs w:val="24"/>
+        </w:rPr>
+      </w:pPr>
+    </w:p>
+    <w:p>
+      <w:pPr>
+        <w:spacing w:after="0" w:line="240" w:lineRule="auto"/>
+        <w:rPr>
+          <w:noProof/>
+          <w:sz w:val="24"/>
+          <w:szCs w:val="24"/>
+        </w:rPr>
+      </w:pPr>
+    </w:p>
+    <w:p>
+      <w:pPr>
+        <w:spacing w:after="0" w:line="240" w:lineRule="auto"/>
+        <w:rPr>
+          <w:noProof/>
+          <w:sz w:val="24"/>
+          <w:szCs w:val="24"/>
+        </w:rPr>
+      </w:pPr>
+    </w:p>
+    <w:p>
+      <w:pPr>
+        <w:spacing w:after="0" w:line="240" w:lineRule="auto"/>
+        <w:rPr>
+          <w:noProof/>
+          <w:sz w:val="24"/>
+          <w:szCs w:val="24"/>
+        </w:rPr>
+      </w:pPr>
+    </w:p>
+    <w:p>
+      <w:pPr>
+        <w:spacing w:after="0" w:line="240" w:lineRule="auto"/>
+        <w:rPr>
+          <w:noProof/>
+          <w:sz w:val="24"/>
+          <w:szCs w:val="24"/>
+        </w:rPr>
+      </w:pPr>
+    </w:p>
+    <w:p>
+      <w:pPr>
+        <w:spacing w:after="0" w:line="240" w:lineRule="auto"/>
+        <w:rPr>
+          <w:noProof/>
+          <w:sz w:val="24"/>
+          <w:szCs w:val="24"/>
+        </w:rPr>
+      </w:pPr>
+    </w:p>
+    <w:p>
+      <w:pPr>
+        <w:spacing w:after="0" w:line="240" w:lineRule="auto"/>
+        <w:rPr>
+          <w:b/>
+          <w:bCs/>
+          <w:noProof/>
+          <w:sz w:val="28"/>
+          <w:szCs w:val="28"/>
+          <w:u w:val="single"/>
+        </w:rPr>
+      </w:pPr>
+      <w:r>
+        <w:rPr>
+          <w:b/>
+          <w:bCs/>
+          <w:noProof/>
+          <w:sz w:val="28"/>
+          <w:szCs w:val="28"/>
+          <w:u w:val="single"/>
+        </w:rPr>
+        <w:t>‘demo_kalman’</w:t>
+      </w:r>
+      <w:r>
+        <w:rPr>
+          <w:b/>
+          <w:bCs/>
+          <w:noProof/>
+          <w:sz w:val="28"/>
+          <w:szCs w:val="28"/>
+          <w:u w:val="single"/>
+        </w:rPr>
+        <w:t>:</w:t>
+      </w:r>
+    </w:p>
+    <w:p>
+      <w:pPr>
+        <w:spacing w:after="0" w:line="240" w:lineRule="auto"/>
+        <w:rPr>
+          <w:noProof/>
+          <w:sz w:val="24"/>
+          <w:szCs w:val="24"/>
+        </w:rPr>
+      </w:pPr>
+    </w:p>
+    <w:p>
+      <w:pPr>
+        <w:spacing w:after="0" w:line="240" w:lineRule="auto"/>
+        <w:rPr>
+          <w:noProof/>
+          <w:sz w:val="24"/>
+          <w:szCs w:val="24"/>
+        </w:rPr>
+      </w:pPr>
+      <w:r>
+        <w:rPr>
+          <w:noProof/>
+          <w:sz w:val="24"/>
+          <w:szCs w:val="24"/>
+        </w:rPr>
+        <w:t>dataset</w:t>
+      </w:r>
+    </w:p>
+    <w:p>
+      <w:pPr>
+        <w:spacing w:after="0" w:line="240" w:lineRule="auto"/>
+        <w:rPr>
+          <w:noProof/>
+          <w:sz w:val="24"/>
+          <w:szCs w:val="24"/>
+        </w:rPr>
+      </w:pPr>
+      <w:r>
+        <w:rPr>
+          <w:noProof/>
+          <w:sz w:val="24"/>
+          <w:szCs w:val="24"/>
+        </w:rPr>
+        <w:t>│</w:t>
+      </w:r>
+    </w:p>
+    <w:p>
+      <w:pPr>
+        <w:spacing w:after="0" w:line="240" w:lineRule="auto"/>
+        <w:rPr>
+          <w:noProof/>
+          <w:sz w:val="24"/>
+          <w:szCs w:val="24"/>
+        </w:rPr>
+      </w:pPr>
+      <w:r>
+        <w:rPr>
+          <w:rFonts w:ascii="MS Gothic" w:eastAsia="MS Gothic" w:hAnsi="MS Gothic" w:cs="MS Gothic" w:hint="eastAsia"/>
+          <w:noProof/>
+          <w:sz w:val="24"/>
+          <w:szCs w:val="24"/>
+        </w:rPr>
+        <w:t>├</w:t>
+      </w:r>
+      <w:r>
+        <w:rPr>
+          <w:rFonts w:ascii="Calibri" w:hAnsi="Calibri" w:cs="Calibri"/>
+          <w:noProof/>
+          <w:sz w:val="24"/>
+          <w:szCs w:val="24"/>
+        </w:rPr>
+        <w:t>──</w:t>
+      </w:r>
+      <w:r>
+        <w:rPr>
+          <w:noProof/>
+          <w:sz w:val="24"/>
+          <w:szCs w:val="24"/>
+        </w:rPr>
+        <w:t xml:space="preserve"> evaluation_model</w:t>
+      </w:r>
+    </w:p>
+    <w:p>
+      <w:pPr>
+        <w:spacing w:after="0" w:line="240" w:lineRule="auto"/>
+        <w:rPr>
+          <w:noProof/>
+          <w:sz w:val="24"/>
+          <w:szCs w:val="24"/>
+        </w:rPr>
+      </w:pPr>
+      <w:r>
+        <w:rPr>
+          <w:noProof/>
+          <w:sz w:val="24"/>
+          <w:szCs w:val="24"/>
+        </w:rPr>
+        <w:t>│      ↓</w:t>
+      </w:r>
+    </w:p>
+    <w:p>
+      <w:pPr>
+        <w:spacing w:after="0" w:line="240" w:lineRule="auto"/>
+        <w:rPr>
+          <w:noProof/>
+          <w:sz w:val="24"/>
+          <w:szCs w:val="24"/>
+        </w:rPr>
+      </w:pPr>
+      <w:r>
+        <w:rPr>
+          <w:noProof/>
+          <w:sz w:val="24"/>
+          <w:szCs w:val="24"/>
+        </w:rPr>
+        <w:t>│   ForecastEvaluator</w:t>
+      </w:r>
+    </w:p>
+    <w:p>
+      <w:pPr>
+        <w:spacing w:after="0" w:line="240" w:lineRule="auto"/>
+        <w:rPr>
+          <w:noProof/>
+          <w:sz w:val="24"/>
+          <w:szCs w:val="24"/>
+        </w:rPr>
+      </w:pPr>
+      <w:r>
+        <w:rPr>
+          <w:noProof/>
+          <w:sz w:val="24"/>
+          <w:szCs w:val="24"/>
+        </w:rPr>
+        <w:t>│      ↓</w:t>
+      </w:r>
+    </w:p>
+    <w:p>
+      <w:pPr>
+        <w:spacing w:after="0" w:line="240" w:lineRule="auto"/>
+        <w:rPr>
+          <w:noProof/>
+          <w:sz w:val="24"/>
+          <w:szCs w:val="24"/>
+        </w:rPr>
+      </w:pPr>
+      <w:r>
+        <w:rPr>
+          <w:noProof/>
+          <w:sz w:val="24"/>
+          <w:szCs w:val="24"/>
+        </w:rPr>
+        <w:t>│   train-only preprocessing</w:t>
+      </w:r>
+    </w:p>
+    <w:p>
+      <w:pPr>
+        <w:spacing w:after="0" w:line="240" w:lineRule="auto"/>
+        <w:rPr>
+          <w:noProof/>
+          <w:sz w:val="24"/>
+          <w:szCs w:val="24"/>
+        </w:rPr>
+      </w:pPr>
+      <w:r>
+        <w:rPr>
+          <w:noProof/>
+          <w:sz w:val="24"/>
+          <w:szCs w:val="24"/>
+        </w:rPr>
+        <w:t>│      ↓</w:t>
+      </w:r>
+    </w:p>
+    <w:p>
+      <w:pPr>
+        <w:spacing w:after="0" w:line="240" w:lineRule="auto"/>
+        <w:rPr>
+          <w:noProof/>
+          <w:sz w:val="24"/>
+          <w:szCs w:val="24"/>
+        </w:rPr>
+      </w:pPr>
+      <w:r>
+        <w:rPr>
+          <w:noProof/>
+          <w:sz w:val="24"/>
+          <w:szCs w:val="24"/>
+        </w:rPr>
+        <w:t>│   holdout evaluation</w:t>
+      </w:r>
+    </w:p>
+    <w:p>
+      <w:pPr>
+        <w:spacing w:after="0" w:line="240" w:lineRule="auto"/>
+        <w:rPr>
+          <w:noProof/>
+          <w:sz w:val="24"/>
+          <w:szCs w:val="24"/>
+        </w:rPr>
+      </w:pPr>
+      <w:r>
+        <w:rPr>
+          <w:noProof/>
+          <w:sz w:val="24"/>
+          <w:szCs w:val="24"/>
+        </w:rPr>
+        <w:t>│</w:t>
+      </w:r>
+    </w:p>
+    <w:p>
+      <w:pPr>
+        <w:spacing w:after="0" w:line="240" w:lineRule="auto"/>
+        <w:rPr>
+          <w:noProof/>
+          <w:sz w:val="24"/>
+          <w:szCs w:val="24"/>
+        </w:rPr>
+      </w:pPr>
+      <w:r>
+        <w:rPr>
+          <w:noProof/>
+          <w:sz w:val="24"/>
+          <w:szCs w:val="24"/>
+        </w:rPr>
+        <w:t>└── model</w:t>
+      </w:r>
+    </w:p>
+    <w:p>
+      <w:pPr>
+        <w:spacing w:after="0" w:line="240" w:lineRule="auto"/>
+        <w:rPr>
+          <w:noProof/>
+          <w:sz w:val="24"/>
+          <w:szCs w:val="24"/>
+        </w:rPr>
+      </w:pPr>
+      <w:r>
+        <w:rPr>
+          <w:noProof/>
+          <w:sz w:val="24"/>
+          <w:szCs w:val="24"/>
+        </w:rPr>
+        <w:t xml:space="preserve">       ↓</w:t>
+      </w:r>
+    </w:p>
+    <w:p>
+      <w:pPr>
+        <w:spacing w:after="0" w:line="240" w:lineRule="auto"/>
+        <w:rPr>
+          <w:noProof/>
+          <w:sz w:val="24"/>
+          <w:szCs w:val="24"/>
+        </w:rPr>
+      </w:pPr>
+      <w:r>
+        <w:rPr>
+          <w:noProof/>
+          <w:sz w:val="24"/>
+          <w:szCs w:val="24"/>
+        </w:rPr>
+        <w:t xml:space="preserve">   full-data preprocessing</w:t>
+      </w:r>
+    </w:p>
+    <w:p>
+      <w:pPr>
+        <w:spacing w:after="0" w:line="240" w:lineRule="auto"/>
+        <w:rPr>
+          <w:noProof/>
+          <w:sz w:val="24"/>
+          <w:szCs w:val="24"/>
+        </w:rPr>
+      </w:pPr>
+      <w:r>
+        <w:rPr>
+          <w:noProof/>
+          <w:sz w:val="24"/>
+          <w:szCs w:val="24"/>
+        </w:rPr>
+        <w:t xml:space="preserve">       ↓</w:t>
+      </w:r>
+    </w:p>
+    <w:p>
+      <w:pPr>
+        <w:spacing w:after="0" w:line="240" w:lineRule="auto"/>
+        <w:rPr>
+          <w:noProof/>
+          <w:sz w:val="24"/>
+          <w:szCs w:val="24"/>
+        </w:rPr>
+      </w:pPr>
+      <w:r>
+        <w:rPr>
+          <w:noProof/>
+          <w:sz w:val="24"/>
+          <w:szCs w:val="24"/>
+        </w:rPr>
+        <w:t xml:space="preserve">   final future forecast</w:t>
+      </w:r>
+    </w:p>
+    <w:p>
+      <w:pPr>
+        <w:spacing w:after="0" w:line="240" w:lineRule="auto"/>
+        <w:rPr>
+          <w:noProof/>
+          <w:sz w:val="24"/>
+          <w:szCs w:val="24"/>
+        </w:rPr>
+      </w:pPr>
+    </w:p>
+    <w:p>
+      <w:pPr>
+        <w:spacing w:after="0" w:line="240" w:lineRule="auto"/>
+        <w:rPr>
+          <w:noProof/>
+          <w:sz w:val="24"/>
+          <w:szCs w:val="24"/>
+        </w:rPr>
+      </w:pPr>
+    </w:p>
+    <w:p>
+      <w:pPr>
+        <w:spacing w:after="0" w:line="240" w:lineRule="auto"/>
+        <w:rPr>
+          <w:b/>
+          <w:bCs/>
+          <w:noProof/>
+          <w:sz w:val="24"/>
+          <w:szCs w:val="24"/>
+        </w:rPr>
+      </w:pPr>
+      <w:r>
+        <w:rPr>
+          <w:b/>
+          <w:bCs/>
+          <w:noProof/>
+          <w:sz w:val="24"/>
+          <w:szCs w:val="24"/>
+        </w:rPr>
+        <w:t>ReportWriter</w:t>
+      </w:r>
+    </w:p>
+    <w:p>
+      <w:pPr>
+        <w:spacing w:after="0" w:line="240" w:lineRule="auto"/>
+        <w:rPr>
+          <w:noProof/>
+          <w:sz w:val="24"/>
+          <w:szCs w:val="24"/>
+        </w:rPr>
+      </w:pPr>
+      <w:r>
+        <w:rPr>
+          <w:noProof/>
+          <w:sz w:val="24"/>
+          <w:szCs w:val="24"/>
+        </w:rPr>
+        <w:t xml:space="preserve">    → evaluation_result</w:t>
+      </w:r>
+    </w:p>
+    <w:p>
+      <w:pPr>
+        <w:spacing w:after="0" w:line="240" w:lineRule="auto"/>
+        <w:rPr>
+          <w:noProof/>
+          <w:sz w:val="24"/>
+          <w:szCs w:val="24"/>
+        </w:rPr>
+      </w:pPr>
+    </w:p>
+    <w:p>
+      <w:pPr>
+        <w:spacing w:after="0" w:line="240" w:lineRule="auto"/>
+        <w:rPr>
+          <w:b/>
+          <w:bCs/>
+          <w:noProof/>
+          <w:sz w:val="24"/>
+          <w:szCs w:val="24"/>
+        </w:rPr>
+      </w:pPr>
+      <w:r>
+        <w:rPr>
+          <w:b/>
+          <w:bCs/>
+          <w:noProof/>
+          <w:sz w:val="24"/>
+          <w:szCs w:val="24"/>
+        </w:rPr>
+        <w:t>ForecastPlot</w:t>
+      </w:r>
+    </w:p>
+    <w:p>
+      <w:pPr>
+        <w:spacing w:after="0" w:line="240" w:lineRule="auto"/>
+        <w:rPr>
+          <w:noProof/>
+          <w:sz w:val="24"/>
+          <w:szCs w:val="24"/>
+        </w:rPr>
+      </w:pPr>
+      <w:r>
+        <w:rPr>
+          <w:noProof/>
+          <w:sz w:val="24"/>
+          <w:szCs w:val="24"/>
+        </w:rPr>
+        <w:t xml:space="preserve">    → evaluation_payload</w:t>
+      </w:r>
+    </w:p>
+    <w:p>
+      <w:pPr>
+        <w:spacing w:after="0" w:line="240" w:lineRule="auto"/>
+        <w:rPr>
+          <w:noProof/>
+          <w:sz w:val="24"/>
+          <w:szCs w:val="24"/>
+        </w:rPr>
+      </w:pPr>
+    </w:p>
+    <w:p>
+      <w:pPr>
+        <w:spacing w:after="0" w:line="240" w:lineRule="auto"/>
+        <w:rPr>
+          <w:b/>
+          <w:bCs/>
+          <w:noProof/>
+          <w:sz w:val="24"/>
+          <w:szCs w:val="24"/>
+        </w:rPr>
+      </w:pPr>
+      <w:r>
+        <w:rPr>
+          <w:b/>
+          <w:bCs/>
+          <w:noProof/>
+          <w:sz w:val="24"/>
+          <w:szCs w:val="24"/>
+        </w:rPr>
+        <w:t>evaluation.json</w:t>
+      </w:r>
+    </w:p>
+    <w:p>
+      <w:pPr>
+        <w:spacing w:after="0" w:line="240" w:lineRule="auto"/>
+        <w:rPr>
+          <w:noProof/>
+          <w:sz w:val="24"/>
+          <w:szCs w:val="24"/>
+        </w:rPr>
+      </w:pPr>
+      <w:r>
+        <w:rPr>
+          <w:noProof/>
+          <w:sz w:val="24"/>
+          <w:szCs w:val="24"/>
+        </w:rPr>
+        <w:t xml:space="preserve">    → evaluation_payload</w:t>
+      </w:r>
+    </w:p>
+    <w:p>
+      <w:pPr>
+        <w:spacing w:after="0" w:line="240" w:lineRule="auto"/>
+        <w:rPr>
+          <w:noProof/>
+          <w:sz w:val="24"/>
+          <w:szCs w:val="24"/>
+        </w:rPr>
+      </w:pPr>
+    </w:p>
+    <w:p>
+      <w:pPr>
+        <w:spacing w:after="0" w:line="240" w:lineRule="auto"/>
+        <w:rPr>
+          <w:noProof/>
+          <w:sz w:val="24"/>
+          <w:szCs w:val="24"/>
+        </w:rPr>
+      </w:pPr>
+    </w:p>
+    <w:p>
+      <w:pPr>
+        <w:spacing w:after="0" w:line="240" w:lineRule="auto"/>
+        <w:rPr>
+          <w:noProof/>
+          <w:sz w:val="24"/>
+          <w:szCs w:val="24"/>
+        </w:rPr>
+      </w:pPr>
+      <w:r>
+        <w:rPr>
+          <w:noProof/>
+          <w:sz w:val="24"/>
+          <w:szCs w:val="24"/>
+        </w:rPr>
+        <w:t>datasets/raw/</w:t>
+      </w:r>
+    </w:p>
+    <w:p>
+      <w:pPr>
+        <w:spacing w:after="0" w:line="240" w:lineRule="auto"/>
+        <w:rPr>
+          <w:noProof/>
+          <w:sz w:val="24"/>
+          <w:szCs w:val="24"/>
+        </w:rPr>
+      </w:pPr>
+      <w:r>
+        <w:rPr>
+          <w:noProof/>
+          <w:sz w:val="24"/>
+          <w:szCs w:val="24"/>
+        </w:rPr>
+        <w:t xml:space="preserve">    + SmartDatasetLoader</w:t>
+      </w:r>
+    </w:p>
+    <w:p>
+      <w:pPr>
+        <w:spacing w:after="0" w:line="240" w:lineRule="auto"/>
+        <w:rPr>
+          <w:noProof/>
+          <w:sz w:val="24"/>
+          <w:szCs w:val="24"/>
+        </w:rPr>
+      </w:pPr>
+      <w:r>
+        <w:rPr>
+          <w:noProof/>
+          <w:sz w:val="24"/>
+          <w:szCs w:val="24"/>
+        </w:rPr>
+        <w:t xml:space="preserve">        ↓</w:t>
+      </w:r>
+    </w:p>
+    <w:p>
+      <w:pPr>
+        <w:spacing w:after="0" w:line="240" w:lineRule="auto"/>
+        <w:rPr>
+          <w:b/>
+          <w:bCs/>
+          <w:noProof/>
+          <w:sz w:val="24"/>
+          <w:szCs w:val="24"/>
+        </w:rPr>
+      </w:pPr>
+      <w:r>
+        <w:rPr>
+          <w:b/>
+          <w:bCs/>
+          <w:noProof/>
+          <w:sz w:val="24"/>
+          <w:szCs w:val="24"/>
+        </w:rPr>
+        <w:t>BatteryDataset(df)</w:t>
+      </w:r>
+    </w:p>
+    <w:p>
+      <w:pPr>
+        <w:spacing w:after="0" w:line="240" w:lineRule="auto"/>
+        <w:rPr>
+          <w:noProof/>
+          <w:sz w:val="24"/>
+          <w:szCs w:val="24"/>
+        </w:rPr>
+      </w:pPr>
+    </w:p>
+    <w:p>
+      <w:pPr>
+        <w:spacing w:after="0" w:line="240" w:lineRule="auto"/>
+        <w:rPr>
+          <w:noProof/>
+          <w:sz w:val="24"/>
+          <w:szCs w:val="24"/>
+        </w:rPr>
+      </w:pPr>
+      <w:r>
+        <w:rPr>
+          <w:noProof/>
+          <w:sz w:val="24"/>
+          <w:szCs w:val="24"/>
+        </w:rPr>
+        <w:t>becomes</w:t>
+      </w:r>
+    </w:p>
+    <w:p>
+      <w:pPr>
+        <w:spacing w:after="0" w:line="240" w:lineRule="auto"/>
+        <w:rPr>
+          <w:noProof/>
+          <w:sz w:val="24"/>
+          <w:szCs w:val="24"/>
+        </w:rPr>
+      </w:pPr>
+    </w:p>
+    <w:p>
+      <w:pPr>
+        <w:spacing w:after="0" w:line="240" w:lineRule="auto"/>
+        <w:rPr>
+          <w:noProof/>
+          <w:sz w:val="24"/>
+          <w:szCs w:val="24"/>
+        </w:rPr>
+      </w:pPr>
+      <w:r>
+        <w:rPr>
+          <w:noProof/>
+          <w:sz w:val="24"/>
+          <w:szCs w:val="24"/>
+        </w:rPr>
+        <w:t>datasets/processed/</w:t>
+      </w:r>
+    </w:p>
+    <w:p>
+      <w:pPr>
+        <w:spacing w:after="0" w:line="240" w:lineRule="auto"/>
+        <w:rPr>
+          <w:b/>
+          <w:bCs/>
+          <w:noProof/>
+          <w:sz w:val="24"/>
+          <w:szCs w:val="24"/>
+        </w:rPr>
+      </w:pPr>
+      <w:r>
+        <w:rPr>
+          <w:b/>
+          <w:bCs/>
+          <w:noProof/>
+          <w:sz w:val="24"/>
+          <w:szCs w:val="24"/>
+        </w:rPr>
+        <w:t xml:space="preserve">    + BatteryDataset.from_processed_csv()</w:t>
       </w:r>
     </w:p>
     <w:sectPr>

</xml_diff>